<commit_message>
Corrigiendo errores recurrentes de 'cuartil-estatura-02.Rmd'
</commit_message>
<xml_diff>
--- a/06-Estadística-Y-Probabilidad/Pensamiento-Aleatorio/06-Medidas-De-Posición/salida/cuartil-estatura-02_1.docx
+++ b/06-Estadística-Y-Probabilidad/Pensamiento-Aleatorio/06-Medidas-De-Posición/salida/cuartil-estatura-02_1.docx
@@ -181,6 +181,116 @@
         </w:numPr>
       </w:pPr>
       <w:r>
+        <w:t xml:space="preserve">172</w:t>
+      </w:r>
+    </w:p>
+    <w:p>
+      <w:pPr>
+        <w:numPr>
+          <w:ilvl w:val="0"/>
+          <w:numId w:val="1000"/>
+        </w:numPr>
+      </w:pPr>
+      <w:r>
+        <w:t xml:space="preserve">2</w:t>
+      </w:r>
+    </w:p>
+    <w:p>
+      <w:pPr>
+        <w:numPr>
+          <w:ilvl w:val="0"/>
+          <w:numId w:val="1000"/>
+        </w:numPr>
+      </w:pPr>
+      <w:r>
+        <w:t xml:space="preserve">145</w:t>
+      </w:r>
+    </w:p>
+    <w:p>
+      <w:pPr>
+        <w:numPr>
+          <w:ilvl w:val="0"/>
+          <w:numId w:val="1000"/>
+        </w:numPr>
+      </w:pPr>
+      <w:r>
+        <w:t xml:space="preserve">3</w:t>
+      </w:r>
+    </w:p>
+    <w:p>
+      <w:pPr>
+        <w:numPr>
+          <w:ilvl w:val="0"/>
+          <w:numId w:val="1000"/>
+        </w:numPr>
+      </w:pPr>
+      <w:r>
+        <w:t xml:space="preserve">163</w:t>
+      </w:r>
+    </w:p>
+    <w:p>
+      <w:pPr>
+        <w:numPr>
+          <w:ilvl w:val="0"/>
+          <w:numId w:val="1000"/>
+        </w:numPr>
+      </w:pPr>
+      <w:r>
+        <w:t xml:space="preserve">4</w:t>
+      </w:r>
+    </w:p>
+    <w:p>
+      <w:pPr>
+        <w:numPr>
+          <w:ilvl w:val="0"/>
+          <w:numId w:val="1000"/>
+        </w:numPr>
+      </w:pPr>
+      <w:r>
+        <w:t xml:space="preserve">155</w:t>
+      </w:r>
+    </w:p>
+    <w:p>
+      <w:pPr>
+        <w:numPr>
+          <w:ilvl w:val="0"/>
+          <w:numId w:val="1000"/>
+        </w:numPr>
+      </w:pPr>
+      <w:r>
+        <w:t xml:space="preserve">5</w:t>
+      </w:r>
+    </w:p>
+    <w:p>
+      <w:pPr>
+        <w:numPr>
+          <w:ilvl w:val="0"/>
+          <w:numId w:val="1000"/>
+        </w:numPr>
+      </w:pPr>
+      <w:r>
+        <w:t xml:space="preserve">184</w:t>
+      </w:r>
+    </w:p>
+    <w:p>
+      <w:pPr>
+        <w:numPr>
+          <w:ilvl w:val="0"/>
+          <w:numId w:val="1000"/>
+        </w:numPr>
+      </w:pPr>
+      <w:r>
+        <w:t xml:space="preserve">6</w:t>
+      </w:r>
+    </w:p>
+    <w:p>
+      <w:pPr>
+        <w:numPr>
+          <w:ilvl w:val="0"/>
+          <w:numId w:val="1000"/>
+        </w:numPr>
+      </w:pPr>
+      <w:r>
         <w:t xml:space="preserve">160</w:t>
       </w:r>
     </w:p>
@@ -192,116 +302,6 @@
         </w:numPr>
       </w:pPr>
       <w:r>
-        <w:t xml:space="preserve">2</w:t>
-      </w:r>
-    </w:p>
-    <w:p>
-      <w:pPr>
-        <w:numPr>
-          <w:ilvl w:val="0"/>
-          <w:numId w:val="1000"/>
-        </w:numPr>
-      </w:pPr>
-      <w:r>
-        <w:t xml:space="preserve">155</w:t>
-      </w:r>
-    </w:p>
-    <w:p>
-      <w:pPr>
-        <w:numPr>
-          <w:ilvl w:val="0"/>
-          <w:numId w:val="1000"/>
-        </w:numPr>
-      </w:pPr>
-      <w:r>
-        <w:t xml:space="preserve">3</w:t>
-      </w:r>
-    </w:p>
-    <w:p>
-      <w:pPr>
-        <w:numPr>
-          <w:ilvl w:val="0"/>
-          <w:numId w:val="1000"/>
-        </w:numPr>
-      </w:pPr>
-      <w:r>
-        <w:t xml:space="preserve">158</w:t>
-      </w:r>
-    </w:p>
-    <w:p>
-      <w:pPr>
-        <w:numPr>
-          <w:ilvl w:val="0"/>
-          <w:numId w:val="1000"/>
-        </w:numPr>
-      </w:pPr>
-      <w:r>
-        <w:t xml:space="preserve">4</w:t>
-      </w:r>
-    </w:p>
-    <w:p>
-      <w:pPr>
-        <w:numPr>
-          <w:ilvl w:val="0"/>
-          <w:numId w:val="1000"/>
-        </w:numPr>
-      </w:pPr>
-      <w:r>
-        <w:t xml:space="preserve">161</w:t>
-      </w:r>
-    </w:p>
-    <w:p>
-      <w:pPr>
-        <w:numPr>
-          <w:ilvl w:val="0"/>
-          <w:numId w:val="1000"/>
-        </w:numPr>
-      </w:pPr>
-      <w:r>
-        <w:t xml:space="preserve">5</w:t>
-      </w:r>
-    </w:p>
-    <w:p>
-      <w:pPr>
-        <w:numPr>
-          <w:ilvl w:val="0"/>
-          <w:numId w:val="1000"/>
-        </w:numPr>
-      </w:pPr>
-      <w:r>
-        <w:t xml:space="preserve">148</w:t>
-      </w:r>
-    </w:p>
-    <w:p>
-      <w:pPr>
-        <w:numPr>
-          <w:ilvl w:val="0"/>
-          <w:numId w:val="1000"/>
-        </w:numPr>
-      </w:pPr>
-      <w:r>
-        <w:t xml:space="preserve">6</w:t>
-      </w:r>
-    </w:p>
-    <w:p>
-      <w:pPr>
-        <w:numPr>
-          <w:ilvl w:val="0"/>
-          <w:numId w:val="1000"/>
-        </w:numPr>
-      </w:pPr>
-      <w:r>
-        <w:t xml:space="preserve">150</w:t>
-      </w:r>
-    </w:p>
-    <w:p>
-      <w:pPr>
-        <w:numPr>
-          <w:ilvl w:val="0"/>
-          <w:numId w:val="1000"/>
-        </w:numPr>
-      </w:pPr>
-      <w:r>
         <w:t xml:space="preserve">7</w:t>
       </w:r>
     </w:p>
@@ -313,183 +313,139 @@
         </w:numPr>
       </w:pPr>
       <w:r>
+        <w:t xml:space="preserve">175</w:t>
+      </w:r>
+    </w:p>
+    <w:p>
+      <w:pPr>
+        <w:numPr>
+          <w:ilvl w:val="0"/>
+          <w:numId w:val="1000"/>
+        </w:numPr>
+      </w:pPr>
+      <w:r>
+        <w:t xml:space="preserve">8</w:t>
+      </w:r>
+    </w:p>
+    <w:p>
+      <w:pPr>
+        <w:numPr>
+          <w:ilvl w:val="0"/>
+          <w:numId w:val="1000"/>
+        </w:numPr>
+      </w:pPr>
+      <w:r>
+        <w:t xml:space="preserve">184</w:t>
+      </w:r>
+    </w:p>
+    <w:p>
+      <w:pPr>
+        <w:numPr>
+          <w:ilvl w:val="0"/>
+          <w:numId w:val="1000"/>
+        </w:numPr>
+      </w:pPr>
+      <w:r>
+        <w:t xml:space="preserve">9</w:t>
+      </w:r>
+    </w:p>
+    <w:p>
+      <w:pPr>
+        <w:numPr>
+          <w:ilvl w:val="0"/>
+          <w:numId w:val="1000"/>
+        </w:numPr>
+      </w:pPr>
+      <w:r>
+        <w:t xml:space="preserve">164</w:t>
+      </w:r>
+    </w:p>
+    <w:p>
+      <w:pPr>
+        <w:numPr>
+          <w:ilvl w:val="0"/>
+          <w:numId w:val="1000"/>
+        </w:numPr>
+      </w:pPr>
+      <w:r>
+        <w:t xml:space="preserve">10</w:t>
+      </w:r>
+    </w:p>
+    <w:p>
+      <w:pPr>
+        <w:numPr>
+          <w:ilvl w:val="0"/>
+          <w:numId w:val="1000"/>
+        </w:numPr>
+      </w:pPr>
+      <w:r>
+        <w:t xml:space="preserve">170</w:t>
+      </w:r>
+    </w:p>
+    <w:p>
+      <w:pPr>
+        <w:numPr>
+          <w:ilvl w:val="0"/>
+          <w:numId w:val="1000"/>
+        </w:numPr>
+      </w:pPr>
+      <w:r>
+        <w:t xml:space="preserve">11</w:t>
+      </w:r>
+    </w:p>
+    <w:p>
+      <w:pPr>
+        <w:numPr>
+          <w:ilvl w:val="0"/>
+          <w:numId w:val="1000"/>
+        </w:numPr>
+      </w:pPr>
+      <w:r>
+        <w:t xml:space="preserve">186</w:t>
+      </w:r>
+    </w:p>
+    <w:p>
+      <w:pPr>
+        <w:numPr>
+          <w:ilvl w:val="0"/>
+          <w:numId w:val="1000"/>
+        </w:numPr>
+      </w:pPr>
+      <w:r>
+        <w:t xml:space="preserve">12</w:t>
+      </w:r>
+    </w:p>
+    <w:p>
+      <w:pPr>
+        <w:numPr>
+          <w:ilvl w:val="0"/>
+          <w:numId w:val="1000"/>
+        </w:numPr>
+      </w:pPr>
+      <w:r>
+        <w:t xml:space="preserve">153</w:t>
+      </w:r>
+    </w:p>
+    <w:p>
+      <w:pPr>
+        <w:numPr>
+          <w:ilvl w:val="0"/>
+          <w:numId w:val="1000"/>
+        </w:numPr>
+      </w:pPr>
+      <w:r>
+        <w:t xml:space="preserve">13</w:t>
+      </w:r>
+    </w:p>
+    <w:p>
+      <w:pPr>
+        <w:numPr>
+          <w:ilvl w:val="0"/>
+          <w:numId w:val="1000"/>
+        </w:numPr>
+      </w:pPr>
+      <w:r>
         <w:t xml:space="preserve">147</w:t>
-      </w:r>
-    </w:p>
-    <w:p>
-      <w:pPr>
-        <w:numPr>
-          <w:ilvl w:val="0"/>
-          <w:numId w:val="1000"/>
-        </w:numPr>
-      </w:pPr>
-      <w:r>
-        <w:t xml:space="preserve">8</w:t>
-      </w:r>
-    </w:p>
-    <w:p>
-      <w:pPr>
-        <w:numPr>
-          <w:ilvl w:val="0"/>
-          <w:numId w:val="1000"/>
-        </w:numPr>
-      </w:pPr>
-      <w:r>
-        <w:t xml:space="preserve">148</w:t>
-      </w:r>
-    </w:p>
-    <w:p>
-      <w:pPr>
-        <w:numPr>
-          <w:ilvl w:val="0"/>
-          <w:numId w:val="1000"/>
-        </w:numPr>
-      </w:pPr>
-      <w:r>
-        <w:t xml:space="preserve">9</w:t>
-      </w:r>
-    </w:p>
-    <w:p>
-      <w:pPr>
-        <w:numPr>
-          <w:ilvl w:val="0"/>
-          <w:numId w:val="1000"/>
-        </w:numPr>
-      </w:pPr>
-      <w:r>
-        <w:t xml:space="preserve">149</w:t>
-      </w:r>
-    </w:p>
-    <w:p>
-      <w:pPr>
-        <w:numPr>
-          <w:ilvl w:val="0"/>
-          <w:numId w:val="1000"/>
-        </w:numPr>
-      </w:pPr>
-      <w:r>
-        <w:t xml:space="preserve">10</w:t>
-      </w:r>
-    </w:p>
-    <w:p>
-      <w:pPr>
-        <w:numPr>
-          <w:ilvl w:val="0"/>
-          <w:numId w:val="1000"/>
-        </w:numPr>
-      </w:pPr>
-      <w:r>
-        <w:t xml:space="preserve">162</w:t>
-      </w:r>
-    </w:p>
-    <w:p>
-      <w:pPr>
-        <w:numPr>
-          <w:ilvl w:val="0"/>
-          <w:numId w:val="1000"/>
-        </w:numPr>
-      </w:pPr>
-      <w:r>
-        <w:t xml:space="preserve">11</w:t>
-      </w:r>
-    </w:p>
-    <w:p>
-      <w:pPr>
-        <w:numPr>
-          <w:ilvl w:val="0"/>
-          <w:numId w:val="1000"/>
-        </w:numPr>
-      </w:pPr>
-      <w:r>
-        <w:t xml:space="preserve">167</w:t>
-      </w:r>
-    </w:p>
-    <w:p>
-      <w:pPr>
-        <w:numPr>
-          <w:ilvl w:val="0"/>
-          <w:numId w:val="1000"/>
-        </w:numPr>
-      </w:pPr>
-      <w:r>
-        <w:t xml:space="preserve">12</w:t>
-      </w:r>
-    </w:p>
-    <w:p>
-      <w:pPr>
-        <w:numPr>
-          <w:ilvl w:val="0"/>
-          <w:numId w:val="1000"/>
-        </w:numPr>
-      </w:pPr>
-      <w:r>
-        <w:t xml:space="preserve">154</w:t>
-      </w:r>
-    </w:p>
-    <w:p>
-      <w:pPr>
-        <w:numPr>
-          <w:ilvl w:val="0"/>
-          <w:numId w:val="1000"/>
-        </w:numPr>
-      </w:pPr>
-      <w:r>
-        <w:t xml:space="preserve">13</w:t>
-      </w:r>
-    </w:p>
-    <w:p>
-      <w:pPr>
-        <w:numPr>
-          <w:ilvl w:val="0"/>
-          <w:numId w:val="1000"/>
-        </w:numPr>
-      </w:pPr>
-      <w:r>
-        <w:t xml:space="preserve">157</w:t>
-      </w:r>
-    </w:p>
-    <w:p>
-      <w:pPr>
-        <w:numPr>
-          <w:ilvl w:val="0"/>
-          <w:numId w:val="1000"/>
-        </w:numPr>
-      </w:pPr>
-      <w:r>
-        <w:t xml:space="preserve">14</w:t>
-      </w:r>
-    </w:p>
-    <w:p>
-      <w:pPr>
-        <w:numPr>
-          <w:ilvl w:val="0"/>
-          <w:numId w:val="1000"/>
-        </w:numPr>
-      </w:pPr>
-      <w:r>
-        <w:t xml:space="preserve">166</w:t>
-      </w:r>
-    </w:p>
-    <w:p>
-      <w:pPr>
-        <w:numPr>
-          <w:ilvl w:val="0"/>
-          <w:numId w:val="1000"/>
-        </w:numPr>
-      </w:pPr>
-      <w:r>
-        <w:t xml:space="preserve">15</w:t>
-      </w:r>
-    </w:p>
-    <w:p>
-      <w:pPr>
-        <w:numPr>
-          <w:ilvl w:val="0"/>
-          <w:numId w:val="1000"/>
-        </w:numPr>
-      </w:pPr>
-      <w:r>
-        <w:t xml:space="preserve">154</w:t>
       </w:r>
     </w:p>
     <w:p>
@@ -579,7 +535,7 @@
               <a:graphicData uri="http://schemas.openxmlformats.org/drawingml/2006/picture">
                 <pic:pic>
                   <pic:nvPicPr>
-                    <pic:cNvPr descr="media/supplements1/exercise1/DiagramaC-1.svg" id="26" name="Picture"/>
+                    <pic:cNvPr descr="media/supplements1/exercise1/DiagramaB-1.svg" id="26" name="Picture"/>
                     <pic:cNvPicPr>
                       <a:picLocks noChangeArrowheads="1" noChangeAspect="1"/>
                     </pic:cNvPicPr>
@@ -697,7 +653,7 @@
               <a:graphicData uri="http://schemas.openxmlformats.org/drawingml/2006/picture">
                 <pic:pic>
                   <pic:nvPicPr>
-                    <pic:cNvPr descr="media/supplements1/exercise1/DiagramaB-1.svg" id="34" name="Picture"/>
+                    <pic:cNvPr descr="media/supplements1/exercise1/DiagramaC-1.svg" id="34" name="Picture"/>
                     <pic:cNvPicPr>
                       <a:picLocks noChangeArrowheads="1" noChangeAspect="1"/>
                     </pic:cNvPicPr>
@@ -768,7 +724,7 @@
         </w:numPr>
       </w:pPr>
       <w:r>
-        <w:t xml:space="preserve">Mínimo: 147 cm</w:t>
+        <w:t xml:space="preserve">Mínimo: 145 cm</w:t>
       </w:r>
     </w:p>
     <w:p>
@@ -779,7 +735,7 @@
         </w:numPr>
       </w:pPr>
       <w:r>
-        <w:t xml:space="preserve">Q1: 149 cm</w:t>
+        <w:t xml:space="preserve">Q1: 155 cm</w:t>
       </w:r>
     </w:p>
     <w:p>
@@ -790,7 +746,7 @@
         </w:numPr>
       </w:pPr>
       <w:r>
-        <w:t xml:space="preserve">Mediana: 155 cm</w:t>
+        <w:t xml:space="preserve">Mediana: 164 cm</w:t>
       </w:r>
     </w:p>
     <w:p>
@@ -801,7 +757,7 @@
         </w:numPr>
       </w:pPr>
       <w:r>
-        <w:t xml:space="preserve">Q3: 161 cm</w:t>
+        <w:t xml:space="preserve">Q3: 175 cm</w:t>
       </w:r>
     </w:p>
     <w:p>
@@ -812,7 +768,7 @@
         </w:numPr>
       </w:pPr>
       <w:r>
-        <w:t xml:space="preserve">Máximo: 167 cm</w:t>
+        <w:t xml:space="preserve">Máximo: 186 cm</w:t>
       </w:r>
     </w:p>
     <w:p>
@@ -893,29 +849,29 @@
         </w:numPr>
       </w:pPr>
       <w:r>
+        <w:t xml:space="preserve">Incorrecto. Los valores están multiplicados por 10.</w:t>
+      </w:r>
+    </w:p>
+    <w:p>
+      <w:pPr>
+        <w:numPr>
+          <w:ilvl w:val="1"/>
+          <w:numId w:val="1004"/>
+        </w:numPr>
+      </w:pPr>
+      <w:r>
+        <w:t xml:space="preserve">Correcto. Este diagrama representa fielmente todos los valores estadísticos.</w:t>
+      </w:r>
+    </w:p>
+    <w:p>
+      <w:pPr>
+        <w:numPr>
+          <w:ilvl w:val="1"/>
+          <w:numId w:val="1004"/>
+        </w:numPr>
+      </w:pPr>
+      <w:r>
         <w:t xml:space="preserve">Incorrecto. Los cuartiles Q1 y Q3 están invertidos.</w:t>
-      </w:r>
-    </w:p>
-    <w:p>
-      <w:pPr>
-        <w:numPr>
-          <w:ilvl w:val="1"/>
-          <w:numId w:val="1004"/>
-        </w:numPr>
-      </w:pPr>
-      <w:r>
-        <w:t xml:space="preserve">Correcto. Este diagrama representa fielmente todos los valores estadísticos.</w:t>
-      </w:r>
-    </w:p>
-    <w:p>
-      <w:pPr>
-        <w:numPr>
-          <w:ilvl w:val="1"/>
-          <w:numId w:val="1004"/>
-        </w:numPr>
-      </w:pPr>
-      <w:r>
-        <w:t xml:space="preserve">Incorrecto. Los valores están multiplicados por 10.</w:t>
       </w:r>
     </w:p>
     <w:p>
@@ -980,7 +936,7 @@
         </w:numPr>
       </w:pPr>
       <w:r>
-        <w:t xml:space="preserve">156</w:t>
+        <w:t xml:space="preserve">157</w:t>
       </w:r>
     </w:p>
     <w:p>
@@ -1002,7 +958,7 @@
         </w:numPr>
       </w:pPr>
       <w:r>
-        <w:t xml:space="preserve">172</w:t>
+        <w:t xml:space="preserve">176</w:t>
       </w:r>
     </w:p>
     <w:p>
@@ -1024,7 +980,7 @@
         </w:numPr>
       </w:pPr>
       <w:r>
-        <w:t xml:space="preserve">160</w:t>
+        <w:t xml:space="preserve">159</w:t>
       </w:r>
     </w:p>
     <w:p>
@@ -1046,7 +1002,7 @@
         </w:numPr>
       </w:pPr>
       <w:r>
-        <w:t xml:space="preserve">171</w:t>
+        <w:t xml:space="preserve">188</w:t>
       </w:r>
     </w:p>
     <w:p>
@@ -1068,6 +1024,160 @@
         </w:numPr>
       </w:pPr>
       <w:r>
+        <w:t xml:space="preserve">164</w:t>
+      </w:r>
+    </w:p>
+    <w:p>
+      <w:pPr>
+        <w:numPr>
+          <w:ilvl w:val="0"/>
+          <w:numId w:val="1000"/>
+        </w:numPr>
+      </w:pPr>
+      <w:r>
+        <w:t xml:space="preserve">6</w:t>
+      </w:r>
+    </w:p>
+    <w:p>
+      <w:pPr>
+        <w:numPr>
+          <w:ilvl w:val="0"/>
+          <w:numId w:val="1000"/>
+        </w:numPr>
+      </w:pPr>
+      <w:r>
+        <w:t xml:space="preserve">179</w:t>
+      </w:r>
+    </w:p>
+    <w:p>
+      <w:pPr>
+        <w:numPr>
+          <w:ilvl w:val="0"/>
+          <w:numId w:val="1000"/>
+        </w:numPr>
+      </w:pPr>
+      <w:r>
+        <w:t xml:space="preserve">7</w:t>
+      </w:r>
+    </w:p>
+    <w:p>
+      <w:pPr>
+        <w:numPr>
+          <w:ilvl w:val="0"/>
+          <w:numId w:val="1000"/>
+        </w:numPr>
+      </w:pPr>
+      <w:r>
+        <w:t xml:space="preserve">162</w:t>
+      </w:r>
+    </w:p>
+    <w:p>
+      <w:pPr>
+        <w:numPr>
+          <w:ilvl w:val="0"/>
+          <w:numId w:val="1000"/>
+        </w:numPr>
+      </w:pPr>
+      <w:r>
+        <w:t xml:space="preserve">8</w:t>
+      </w:r>
+    </w:p>
+    <w:p>
+      <w:pPr>
+        <w:numPr>
+          <w:ilvl w:val="0"/>
+          <w:numId w:val="1000"/>
+        </w:numPr>
+      </w:pPr>
+      <w:r>
+        <w:t xml:space="preserve">182</w:t>
+      </w:r>
+    </w:p>
+    <w:p>
+      <w:pPr>
+        <w:numPr>
+          <w:ilvl w:val="0"/>
+          <w:numId w:val="1000"/>
+        </w:numPr>
+      </w:pPr>
+      <w:r>
+        <w:t xml:space="preserve">9</w:t>
+      </w:r>
+    </w:p>
+    <w:p>
+      <w:pPr>
+        <w:numPr>
+          <w:ilvl w:val="0"/>
+          <w:numId w:val="1000"/>
+        </w:numPr>
+      </w:pPr>
+      <w:r>
+        <w:t xml:space="preserve">194</w:t>
+      </w:r>
+    </w:p>
+    <w:p>
+      <w:pPr>
+        <w:numPr>
+          <w:ilvl w:val="0"/>
+          <w:numId w:val="1000"/>
+        </w:numPr>
+      </w:pPr>
+      <w:r>
+        <w:t xml:space="preserve">10</w:t>
+      </w:r>
+    </w:p>
+    <w:p>
+      <w:pPr>
+        <w:numPr>
+          <w:ilvl w:val="0"/>
+          <w:numId w:val="1000"/>
+        </w:numPr>
+      </w:pPr>
+      <w:r>
+        <w:t xml:space="preserve">170</w:t>
+      </w:r>
+    </w:p>
+    <w:p>
+      <w:pPr>
+        <w:numPr>
+          <w:ilvl w:val="0"/>
+          <w:numId w:val="1000"/>
+        </w:numPr>
+      </w:pPr>
+      <w:r>
+        <w:t xml:space="preserve">11</w:t>
+      </w:r>
+    </w:p>
+    <w:p>
+      <w:pPr>
+        <w:numPr>
+          <w:ilvl w:val="0"/>
+          <w:numId w:val="1000"/>
+        </w:numPr>
+      </w:pPr>
+      <w:r>
+        <w:t xml:space="preserve">174</w:t>
+      </w:r>
+    </w:p>
+    <w:p>
+      <w:pPr>
+        <w:numPr>
+          <w:ilvl w:val="0"/>
+          <w:numId w:val="1000"/>
+        </w:numPr>
+      </w:pPr>
+      <w:r>
+        <w:t xml:space="preserve">12</w:t>
+      </w:r>
+    </w:p>
+    <w:p>
+      <w:pPr>
+        <w:numPr>
+          <w:ilvl w:val="0"/>
+          <w:numId w:val="1000"/>
+        </w:numPr>
+      </w:pPr>
+      <w:r>
         <w:t xml:space="preserve">158</w:t>
       </w:r>
     </w:p>
@@ -1079,128 +1189,62 @@
         </w:numPr>
       </w:pPr>
       <w:r>
-        <w:t xml:space="preserve">6</w:t>
-      </w:r>
-    </w:p>
-    <w:p>
-      <w:pPr>
-        <w:numPr>
-          <w:ilvl w:val="0"/>
-          <w:numId w:val="1000"/>
-        </w:numPr>
-      </w:pPr>
-      <w:r>
-        <w:t xml:space="preserve">165</w:t>
-      </w:r>
-    </w:p>
-    <w:p>
-      <w:pPr>
-        <w:numPr>
-          <w:ilvl w:val="0"/>
-          <w:numId w:val="1000"/>
-        </w:numPr>
-      </w:pPr>
-      <w:r>
-        <w:t xml:space="preserve">7</w:t>
-      </w:r>
-    </w:p>
-    <w:p>
-      <w:pPr>
-        <w:numPr>
-          <w:ilvl w:val="0"/>
-          <w:numId w:val="1000"/>
-        </w:numPr>
-      </w:pPr>
-      <w:r>
-        <w:t xml:space="preserve">159</w:t>
-      </w:r>
-    </w:p>
-    <w:p>
-      <w:pPr>
-        <w:numPr>
-          <w:ilvl w:val="0"/>
-          <w:numId w:val="1000"/>
-        </w:numPr>
-      </w:pPr>
-      <w:r>
-        <w:t xml:space="preserve">8</w:t>
-      </w:r>
-    </w:p>
-    <w:p>
-      <w:pPr>
-        <w:numPr>
-          <w:ilvl w:val="0"/>
-          <w:numId w:val="1000"/>
-        </w:numPr>
-      </w:pPr>
-      <w:r>
-        <w:t xml:space="preserve">171</w:t>
-      </w:r>
-    </w:p>
-    <w:p>
-      <w:pPr>
-        <w:numPr>
-          <w:ilvl w:val="0"/>
-          <w:numId w:val="1000"/>
-        </w:numPr>
-      </w:pPr>
-      <w:r>
-        <w:t xml:space="preserve">9</w:t>
-      </w:r>
-    </w:p>
-    <w:p>
-      <w:pPr>
-        <w:numPr>
-          <w:ilvl w:val="0"/>
-          <w:numId w:val="1000"/>
-        </w:numPr>
-      </w:pPr>
-      <w:r>
-        <w:t xml:space="preserve">156</w:t>
-      </w:r>
-    </w:p>
-    <w:p>
-      <w:pPr>
-        <w:numPr>
-          <w:ilvl w:val="0"/>
-          <w:numId w:val="1000"/>
-        </w:numPr>
-      </w:pPr>
-      <w:r>
-        <w:t xml:space="preserve">10</w:t>
-      </w:r>
-    </w:p>
-    <w:p>
-      <w:pPr>
-        <w:numPr>
-          <w:ilvl w:val="0"/>
-          <w:numId w:val="1000"/>
-        </w:numPr>
-      </w:pPr>
-      <w:r>
-        <w:t xml:space="preserve">162</w:t>
-      </w:r>
-    </w:p>
-    <w:p>
-      <w:pPr>
-        <w:numPr>
-          <w:ilvl w:val="0"/>
-          <w:numId w:val="1000"/>
-        </w:numPr>
-      </w:pPr>
-      <w:r>
-        <w:t xml:space="preserve">11</w:t>
-      </w:r>
-    </w:p>
-    <w:p>
-      <w:pPr>
-        <w:numPr>
-          <w:ilvl w:val="0"/>
-          <w:numId w:val="1000"/>
-        </w:numPr>
-      </w:pPr>
-      <w:r>
-        <w:t xml:space="preserve">172</w:t>
+        <w:t xml:space="preserve">13</w:t>
+      </w:r>
+    </w:p>
+    <w:p>
+      <w:pPr>
+        <w:numPr>
+          <w:ilvl w:val="0"/>
+          <w:numId w:val="1000"/>
+        </w:numPr>
+      </w:pPr>
+      <w:r>
+        <w:t xml:space="preserve">193</w:t>
+      </w:r>
+    </w:p>
+    <w:p>
+      <w:pPr>
+        <w:numPr>
+          <w:ilvl w:val="0"/>
+          <w:numId w:val="1000"/>
+        </w:numPr>
+      </w:pPr>
+      <w:r>
+        <w:t xml:space="preserve">14</w:t>
+      </w:r>
+    </w:p>
+    <w:p>
+      <w:pPr>
+        <w:numPr>
+          <w:ilvl w:val="0"/>
+          <w:numId w:val="1000"/>
+        </w:numPr>
+      </w:pPr>
+      <w:r>
+        <w:t xml:space="preserve">183</w:t>
+      </w:r>
+    </w:p>
+    <w:p>
+      <w:pPr>
+        <w:numPr>
+          <w:ilvl w:val="0"/>
+          <w:numId w:val="1000"/>
+        </w:numPr>
+      </w:pPr>
+      <w:r>
+        <w:t xml:space="preserve">15</w:t>
+      </w:r>
+    </w:p>
+    <w:p>
+      <w:pPr>
+        <w:numPr>
+          <w:ilvl w:val="0"/>
+          <w:numId w:val="1000"/>
+        </w:numPr>
+      </w:pPr>
+      <w:r>
+        <w:t xml:space="preserve">184</w:t>
       </w:r>
     </w:p>
     <w:p>
@@ -1231,7 +1275,7 @@
               <a:graphicData uri="http://schemas.openxmlformats.org/drawingml/2006/picture">
                 <pic:pic>
                   <pic:nvPicPr>
-                    <pic:cNvPr descr="media/supplements1/exercise2/DiagramaC-1.svg" id="42" name="Picture"/>
+                    <pic:cNvPr descr="media/supplements1/exercise2/DiagramaB-1.svg" id="42" name="Picture"/>
                     <pic:cNvPicPr>
                       <a:picLocks noChangeArrowheads="1" noChangeAspect="1"/>
                     </pic:cNvPicPr>
@@ -1290,7 +1334,7 @@
               <a:graphicData uri="http://schemas.openxmlformats.org/drawingml/2006/picture">
                 <pic:pic>
                   <pic:nvPicPr>
-                    <pic:cNvPr descr="media/supplements1/exercise2/DiagramaB-1.svg" id="46" name="Picture"/>
+                    <pic:cNvPr descr="media/supplements1/exercise2/DiagramaA-1.svg" id="46" name="Picture"/>
                     <pic:cNvPicPr>
                       <a:picLocks noChangeArrowheads="1" noChangeAspect="1"/>
                     </pic:cNvPicPr>
@@ -1349,7 +1393,7 @@
               <a:graphicData uri="http://schemas.openxmlformats.org/drawingml/2006/picture">
                 <pic:pic>
                   <pic:nvPicPr>
-                    <pic:cNvPr descr="media/supplements1/exercise2/DiagramaD-1.svg" id="50" name="Picture"/>
+                    <pic:cNvPr descr="media/supplements1/exercise2/DiagramaC-1.svg" id="50" name="Picture"/>
                     <pic:cNvPicPr>
                       <a:picLocks noChangeArrowheads="1" noChangeAspect="1"/>
                     </pic:cNvPicPr>
@@ -1408,7 +1452,7 @@
               <a:graphicData uri="http://schemas.openxmlformats.org/drawingml/2006/picture">
                 <pic:pic>
                   <pic:nvPicPr>
-                    <pic:cNvPr descr="media/supplements1/exercise2/DiagramaA-1.svg" id="54" name="Picture"/>
+                    <pic:cNvPr descr="media/supplements1/exercise2/DiagramaD-1.svg" id="54" name="Picture"/>
                     <pic:cNvPicPr>
                       <a:picLocks noChangeArrowheads="1" noChangeAspect="1"/>
                     </pic:cNvPicPr>
@@ -1479,7 +1523,7 @@
         </w:numPr>
       </w:pPr>
       <w:r>
-        <w:t xml:space="preserve">Mínimo: 156 cm</w:t>
+        <w:t xml:space="preserve">Mínimo: 157 cm</w:t>
       </w:r>
     </w:p>
     <w:p>
@@ -1490,7 +1534,7 @@
         </w:numPr>
       </w:pPr>
       <w:r>
-        <w:t xml:space="preserve">Q1: 158 cm</w:t>
+        <w:t xml:space="preserve">Q1: 162 cm</w:t>
       </w:r>
     </w:p>
     <w:p>
@@ -1501,7 +1545,7 @@
         </w:numPr>
       </w:pPr>
       <w:r>
-        <w:t xml:space="preserve">Mediana: 162 cm</w:t>
+        <w:t xml:space="preserve">Mediana: 176 cm</w:t>
       </w:r>
     </w:p>
     <w:p>
@@ -1512,7 +1556,7 @@
         </w:numPr>
       </w:pPr>
       <w:r>
-        <w:t xml:space="preserve">Q3: 171 cm</w:t>
+        <w:t xml:space="preserve">Q3: 184 cm</w:t>
       </w:r>
     </w:p>
     <w:p>
@@ -1523,7 +1567,7 @@
         </w:numPr>
       </w:pPr>
       <w:r>
-        <w:t xml:space="preserve">Máximo: 172 cm</w:t>
+        <w:t xml:space="preserve">Máximo: 194 cm</w:t>
       </w:r>
     </w:p>
     <w:p>
@@ -1593,6 +1637,28 @@
         </w:numPr>
       </w:pPr>
       <w:r>
+        <w:t xml:space="preserve">Incorrecto. Los valores están multiplicados por 10.</w:t>
+      </w:r>
+    </w:p>
+    <w:p>
+      <w:pPr>
+        <w:numPr>
+          <w:ilvl w:val="1"/>
+          <w:numId w:val="1007"/>
+        </w:numPr>
+      </w:pPr>
+      <w:r>
+        <w:t xml:space="preserve">Correcto. Este diagrama representa fielmente todos los valores estadísticos.</w:t>
+      </w:r>
+    </w:p>
+    <w:p>
+      <w:pPr>
+        <w:numPr>
+          <w:ilvl w:val="1"/>
+          <w:numId w:val="1007"/>
+        </w:numPr>
+      </w:pPr>
+      <w:r>
         <w:t xml:space="preserve">Incorrecto. Los cuartiles Q1 y Q3 están invertidos.</w:t>
       </w:r>
     </w:p>
@@ -1604,29 +1670,7 @@
         </w:numPr>
       </w:pPr>
       <w:r>
-        <w:t xml:space="preserve">Incorrecto. Los valores están multiplicados por 10.</w:t>
-      </w:r>
-    </w:p>
-    <w:p>
-      <w:pPr>
-        <w:numPr>
-          <w:ilvl w:val="1"/>
-          <w:numId w:val="1007"/>
-        </w:numPr>
-      </w:pPr>
-      <w:r>
         <w:t xml:space="preserve">Incorrecto. La mediana está mal calculada.</w:t>
-      </w:r>
-    </w:p>
-    <w:p>
-      <w:pPr>
-        <w:numPr>
-          <w:ilvl w:val="1"/>
-          <w:numId w:val="1007"/>
-        </w:numPr>
-      </w:pPr>
-      <w:r>
-        <w:t xml:space="preserve">Correcto. Este diagrama representa fielmente todos los valores estadísticos.</w:t>
       </w:r>
     </w:p>
     <w:p>
@@ -1691,7 +1735,7 @@
         </w:numPr>
       </w:pPr>
       <w:r>
-        <w:t xml:space="preserve">188</w:t>
+        <w:t xml:space="preserve">162</w:t>
       </w:r>
     </w:p>
     <w:p>
@@ -1713,7 +1757,7 @@
         </w:numPr>
       </w:pPr>
       <w:r>
-        <w:t xml:space="preserve">154</w:t>
+        <w:t xml:space="preserve">162</w:t>
       </w:r>
     </w:p>
     <w:p>
@@ -1735,6 +1779,138 @@
         </w:numPr>
       </w:pPr>
       <w:r>
+        <w:t xml:space="preserve">178</w:t>
+      </w:r>
+    </w:p>
+    <w:p>
+      <w:pPr>
+        <w:numPr>
+          <w:ilvl w:val="0"/>
+          <w:numId w:val="1000"/>
+        </w:numPr>
+      </w:pPr>
+      <w:r>
+        <w:t xml:space="preserve">4</w:t>
+      </w:r>
+    </w:p>
+    <w:p>
+      <w:pPr>
+        <w:numPr>
+          <w:ilvl w:val="0"/>
+          <w:numId w:val="1000"/>
+        </w:numPr>
+      </w:pPr>
+      <w:r>
+        <w:t xml:space="preserve">169</w:t>
+      </w:r>
+    </w:p>
+    <w:p>
+      <w:pPr>
+        <w:numPr>
+          <w:ilvl w:val="0"/>
+          <w:numId w:val="1000"/>
+        </w:numPr>
+      </w:pPr>
+      <w:r>
+        <w:t xml:space="preserve">5</w:t>
+      </w:r>
+    </w:p>
+    <w:p>
+      <w:pPr>
+        <w:numPr>
+          <w:ilvl w:val="0"/>
+          <w:numId w:val="1000"/>
+        </w:numPr>
+      </w:pPr>
+      <w:r>
+        <w:t xml:space="preserve">152</w:t>
+      </w:r>
+    </w:p>
+    <w:p>
+      <w:pPr>
+        <w:numPr>
+          <w:ilvl w:val="0"/>
+          <w:numId w:val="1000"/>
+        </w:numPr>
+      </w:pPr>
+      <w:r>
+        <w:t xml:space="preserve">6</w:t>
+      </w:r>
+    </w:p>
+    <w:p>
+      <w:pPr>
+        <w:numPr>
+          <w:ilvl w:val="0"/>
+          <w:numId w:val="1000"/>
+        </w:numPr>
+      </w:pPr>
+      <w:r>
+        <w:t xml:space="preserve">155</w:t>
+      </w:r>
+    </w:p>
+    <w:p>
+      <w:pPr>
+        <w:numPr>
+          <w:ilvl w:val="0"/>
+          <w:numId w:val="1000"/>
+        </w:numPr>
+      </w:pPr>
+      <w:r>
+        <w:t xml:space="preserve">7</w:t>
+      </w:r>
+    </w:p>
+    <w:p>
+      <w:pPr>
+        <w:numPr>
+          <w:ilvl w:val="0"/>
+          <w:numId w:val="1000"/>
+        </w:numPr>
+      </w:pPr>
+      <w:r>
+        <w:t xml:space="preserve">162</w:t>
+      </w:r>
+    </w:p>
+    <w:p>
+      <w:pPr>
+        <w:numPr>
+          <w:ilvl w:val="0"/>
+          <w:numId w:val="1000"/>
+        </w:numPr>
+      </w:pPr>
+      <w:r>
+        <w:t xml:space="preserve">8</w:t>
+      </w:r>
+    </w:p>
+    <w:p>
+      <w:pPr>
+        <w:numPr>
+          <w:ilvl w:val="0"/>
+          <w:numId w:val="1000"/>
+        </w:numPr>
+      </w:pPr>
+      <w:r>
+        <w:t xml:space="preserve">159</w:t>
+      </w:r>
+    </w:p>
+    <w:p>
+      <w:pPr>
+        <w:numPr>
+          <w:ilvl w:val="0"/>
+          <w:numId w:val="1000"/>
+        </w:numPr>
+      </w:pPr>
+      <w:r>
+        <w:t xml:space="preserve">9</w:t>
+      </w:r>
+    </w:p>
+    <w:p>
+      <w:pPr>
+        <w:numPr>
+          <w:ilvl w:val="0"/>
+          <w:numId w:val="1000"/>
+        </w:numPr>
+      </w:pPr>
+      <w:r>
         <w:t xml:space="preserve">171</w:t>
       </w:r>
     </w:p>
@@ -1746,7 +1922,139 @@
         </w:numPr>
       </w:pPr>
       <w:r>
-        <w:t xml:space="preserve">4</w:t>
+        <w:t xml:space="preserve">10</w:t>
+      </w:r>
+    </w:p>
+    <w:p>
+      <w:pPr>
+        <w:numPr>
+          <w:ilvl w:val="0"/>
+          <w:numId w:val="1000"/>
+        </w:numPr>
+      </w:pPr>
+      <w:r>
+        <w:t xml:space="preserve">169</w:t>
+      </w:r>
+    </w:p>
+    <w:p>
+      <w:pPr>
+        <w:numPr>
+          <w:ilvl w:val="0"/>
+          <w:numId w:val="1000"/>
+        </w:numPr>
+      </w:pPr>
+      <w:r>
+        <w:t xml:space="preserve">11</w:t>
+      </w:r>
+    </w:p>
+    <w:p>
+      <w:pPr>
+        <w:numPr>
+          <w:ilvl w:val="0"/>
+          <w:numId w:val="1000"/>
+        </w:numPr>
+      </w:pPr>
+      <w:r>
+        <w:t xml:space="preserve">178</w:t>
+      </w:r>
+    </w:p>
+    <w:p>
+      <w:pPr>
+        <w:numPr>
+          <w:ilvl w:val="0"/>
+          <w:numId w:val="1000"/>
+        </w:numPr>
+      </w:pPr>
+      <w:r>
+        <w:t xml:space="preserve">12</w:t>
+      </w:r>
+    </w:p>
+    <w:p>
+      <w:pPr>
+        <w:numPr>
+          <w:ilvl w:val="0"/>
+          <w:numId w:val="1000"/>
+        </w:numPr>
+      </w:pPr>
+      <w:r>
+        <w:t xml:space="preserve">174</w:t>
+      </w:r>
+    </w:p>
+    <w:p>
+      <w:pPr>
+        <w:numPr>
+          <w:ilvl w:val="0"/>
+          <w:numId w:val="1000"/>
+        </w:numPr>
+      </w:pPr>
+      <w:r>
+        <w:t xml:space="preserve">13</w:t>
+      </w:r>
+    </w:p>
+    <w:p>
+      <w:pPr>
+        <w:numPr>
+          <w:ilvl w:val="0"/>
+          <w:numId w:val="1000"/>
+        </w:numPr>
+      </w:pPr>
+      <w:r>
+        <w:t xml:space="preserve">168</w:t>
+      </w:r>
+    </w:p>
+    <w:p>
+      <w:pPr>
+        <w:numPr>
+          <w:ilvl w:val="0"/>
+          <w:numId w:val="1000"/>
+        </w:numPr>
+      </w:pPr>
+      <w:r>
+        <w:t xml:space="preserve">14</w:t>
+      </w:r>
+    </w:p>
+    <w:p>
+      <w:pPr>
+        <w:numPr>
+          <w:ilvl w:val="0"/>
+          <w:numId w:val="1000"/>
+        </w:numPr>
+      </w:pPr>
+      <w:r>
+        <w:t xml:space="preserve">171</w:t>
+      </w:r>
+    </w:p>
+    <w:p>
+      <w:pPr>
+        <w:numPr>
+          <w:ilvl w:val="0"/>
+          <w:numId w:val="1000"/>
+        </w:numPr>
+      </w:pPr>
+      <w:r>
+        <w:t xml:space="preserve">15</w:t>
+      </w:r>
+    </w:p>
+    <w:p>
+      <w:pPr>
+        <w:numPr>
+          <w:ilvl w:val="0"/>
+          <w:numId w:val="1000"/>
+        </w:numPr>
+      </w:pPr>
+      <w:r>
+        <w:t xml:space="preserve">169</w:t>
+      </w:r>
+    </w:p>
+    <w:p>
+      <w:pPr>
+        <w:numPr>
+          <w:ilvl w:val="0"/>
+          <w:numId w:val="1000"/>
+        </w:numPr>
+      </w:pPr>
+      <w:r>
+        <w:t xml:space="preserve">16</w:t>
       </w:r>
     </w:p>
     <w:p>
@@ -1768,7 +2076,51 @@
         </w:numPr>
       </w:pPr>
       <w:r>
-        <w:t xml:space="preserve">5</w:t>
+        <w:t xml:space="preserve">17</w:t>
+      </w:r>
+    </w:p>
+    <w:p>
+      <w:pPr>
+        <w:numPr>
+          <w:ilvl w:val="0"/>
+          <w:numId w:val="1000"/>
+        </w:numPr>
+      </w:pPr>
+      <w:r>
+        <w:t xml:space="preserve">166</w:t>
+      </w:r>
+    </w:p>
+    <w:p>
+      <w:pPr>
+        <w:numPr>
+          <w:ilvl w:val="0"/>
+          <w:numId w:val="1000"/>
+        </w:numPr>
+      </w:pPr>
+      <w:r>
+        <w:t xml:space="preserve">18</w:t>
+      </w:r>
+    </w:p>
+    <w:p>
+      <w:pPr>
+        <w:numPr>
+          <w:ilvl w:val="0"/>
+          <w:numId w:val="1000"/>
+        </w:numPr>
+      </w:pPr>
+      <w:r>
+        <w:t xml:space="preserve">168</w:t>
+      </w:r>
+    </w:p>
+    <w:p>
+      <w:pPr>
+        <w:numPr>
+          <w:ilvl w:val="0"/>
+          <w:numId w:val="1000"/>
+        </w:numPr>
+      </w:pPr>
+      <w:r>
+        <w:t xml:space="preserve">19</w:t>
       </w:r>
     </w:p>
     <w:p>
@@ -1780,358 +2132,6 @@
       </w:pPr>
       <w:r>
         <w:t xml:space="preserve">167</w:t>
-      </w:r>
-    </w:p>
-    <w:p>
-      <w:pPr>
-        <w:numPr>
-          <w:ilvl w:val="0"/>
-          <w:numId w:val="1000"/>
-        </w:numPr>
-      </w:pPr>
-      <w:r>
-        <w:t xml:space="preserve">6</w:t>
-      </w:r>
-    </w:p>
-    <w:p>
-      <w:pPr>
-        <w:numPr>
-          <w:ilvl w:val="0"/>
-          <w:numId w:val="1000"/>
-        </w:numPr>
-      </w:pPr>
-      <w:r>
-        <w:t xml:space="preserve">167</w:t>
-      </w:r>
-    </w:p>
-    <w:p>
-      <w:pPr>
-        <w:numPr>
-          <w:ilvl w:val="0"/>
-          <w:numId w:val="1000"/>
-        </w:numPr>
-      </w:pPr>
-      <w:r>
-        <w:t xml:space="preserve">7</w:t>
-      </w:r>
-    </w:p>
-    <w:p>
-      <w:pPr>
-        <w:numPr>
-          <w:ilvl w:val="0"/>
-          <w:numId w:val="1000"/>
-        </w:numPr>
-      </w:pPr>
-      <w:r>
-        <w:t xml:space="preserve">164</w:t>
-      </w:r>
-    </w:p>
-    <w:p>
-      <w:pPr>
-        <w:numPr>
-          <w:ilvl w:val="0"/>
-          <w:numId w:val="1000"/>
-        </w:numPr>
-      </w:pPr>
-      <w:r>
-        <w:t xml:space="preserve">8</w:t>
-      </w:r>
-    </w:p>
-    <w:p>
-      <w:pPr>
-        <w:numPr>
-          <w:ilvl w:val="0"/>
-          <w:numId w:val="1000"/>
-        </w:numPr>
-      </w:pPr>
-      <w:r>
-        <w:t xml:space="preserve">166</w:t>
-      </w:r>
-    </w:p>
-    <w:p>
-      <w:pPr>
-        <w:numPr>
-          <w:ilvl w:val="0"/>
-          <w:numId w:val="1000"/>
-        </w:numPr>
-      </w:pPr>
-      <w:r>
-        <w:t xml:space="preserve">9</w:t>
-      </w:r>
-    </w:p>
-    <w:p>
-      <w:pPr>
-        <w:numPr>
-          <w:ilvl w:val="0"/>
-          <w:numId w:val="1000"/>
-        </w:numPr>
-      </w:pPr>
-      <w:r>
-        <w:t xml:space="preserve">181</w:t>
-      </w:r>
-    </w:p>
-    <w:p>
-      <w:pPr>
-        <w:numPr>
-          <w:ilvl w:val="0"/>
-          <w:numId w:val="1000"/>
-        </w:numPr>
-      </w:pPr>
-      <w:r>
-        <w:t xml:space="preserve">10</w:t>
-      </w:r>
-    </w:p>
-    <w:p>
-      <w:pPr>
-        <w:numPr>
-          <w:ilvl w:val="0"/>
-          <w:numId w:val="1000"/>
-        </w:numPr>
-      </w:pPr>
-      <w:r>
-        <w:t xml:space="preserve">169</w:t>
-      </w:r>
-    </w:p>
-    <w:p>
-      <w:pPr>
-        <w:numPr>
-          <w:ilvl w:val="0"/>
-          <w:numId w:val="1000"/>
-        </w:numPr>
-      </w:pPr>
-      <w:r>
-        <w:t xml:space="preserve">11</w:t>
-      </w:r>
-    </w:p>
-    <w:p>
-      <w:pPr>
-        <w:numPr>
-          <w:ilvl w:val="0"/>
-          <w:numId w:val="1000"/>
-        </w:numPr>
-      </w:pPr>
-      <w:r>
-        <w:t xml:space="preserve">176</w:t>
-      </w:r>
-    </w:p>
-    <w:p>
-      <w:pPr>
-        <w:numPr>
-          <w:ilvl w:val="0"/>
-          <w:numId w:val="1000"/>
-        </w:numPr>
-      </w:pPr>
-      <w:r>
-        <w:t xml:space="preserve">12</w:t>
-      </w:r>
-    </w:p>
-    <w:p>
-      <w:pPr>
-        <w:numPr>
-          <w:ilvl w:val="0"/>
-          <w:numId w:val="1000"/>
-        </w:numPr>
-      </w:pPr>
-      <w:r>
-        <w:t xml:space="preserve">169</w:t>
-      </w:r>
-    </w:p>
-    <w:p>
-      <w:pPr>
-        <w:numPr>
-          <w:ilvl w:val="0"/>
-          <w:numId w:val="1000"/>
-        </w:numPr>
-      </w:pPr>
-      <w:r>
-        <w:t xml:space="preserve">13</w:t>
-      </w:r>
-    </w:p>
-    <w:p>
-      <w:pPr>
-        <w:numPr>
-          <w:ilvl w:val="0"/>
-          <w:numId w:val="1000"/>
-        </w:numPr>
-      </w:pPr>
-      <w:r>
-        <w:t xml:space="preserve">177</w:t>
-      </w:r>
-    </w:p>
-    <w:p>
-      <w:pPr>
-        <w:numPr>
-          <w:ilvl w:val="0"/>
-          <w:numId w:val="1000"/>
-        </w:numPr>
-      </w:pPr>
-      <w:r>
-        <w:t xml:space="preserve">14</w:t>
-      </w:r>
-    </w:p>
-    <w:p>
-      <w:pPr>
-        <w:numPr>
-          <w:ilvl w:val="0"/>
-          <w:numId w:val="1000"/>
-        </w:numPr>
-      </w:pPr>
-      <w:r>
-        <w:t xml:space="preserve">168</w:t>
-      </w:r>
-    </w:p>
-    <w:p>
-      <w:pPr>
-        <w:numPr>
-          <w:ilvl w:val="0"/>
-          <w:numId w:val="1000"/>
-        </w:numPr>
-      </w:pPr>
-      <w:r>
-        <w:t xml:space="preserve">15</w:t>
-      </w:r>
-    </w:p>
-    <w:p>
-      <w:pPr>
-        <w:numPr>
-          <w:ilvl w:val="0"/>
-          <w:numId w:val="1000"/>
-        </w:numPr>
-      </w:pPr>
-      <w:r>
-        <w:t xml:space="preserve">168</w:t>
-      </w:r>
-    </w:p>
-    <w:p>
-      <w:pPr>
-        <w:numPr>
-          <w:ilvl w:val="0"/>
-          <w:numId w:val="1000"/>
-        </w:numPr>
-      </w:pPr>
-      <w:r>
-        <w:t xml:space="preserve">16</w:t>
-      </w:r>
-    </w:p>
-    <w:p>
-      <w:pPr>
-        <w:numPr>
-          <w:ilvl w:val="0"/>
-          <w:numId w:val="1000"/>
-        </w:numPr>
-      </w:pPr>
-      <w:r>
-        <w:t xml:space="preserve">185</w:t>
-      </w:r>
-    </w:p>
-    <w:p>
-      <w:pPr>
-        <w:numPr>
-          <w:ilvl w:val="0"/>
-          <w:numId w:val="1000"/>
-        </w:numPr>
-      </w:pPr>
-      <w:r>
-        <w:t xml:space="preserve">17</w:t>
-      </w:r>
-    </w:p>
-    <w:p>
-      <w:pPr>
-        <w:numPr>
-          <w:ilvl w:val="0"/>
-          <w:numId w:val="1000"/>
-        </w:numPr>
-      </w:pPr>
-      <w:r>
-        <w:t xml:space="preserve">165</w:t>
-      </w:r>
-    </w:p>
-    <w:p>
-      <w:pPr>
-        <w:numPr>
-          <w:ilvl w:val="0"/>
-          <w:numId w:val="1000"/>
-        </w:numPr>
-      </w:pPr>
-      <w:r>
-        <w:t xml:space="preserve">18</w:t>
-      </w:r>
-    </w:p>
-    <w:p>
-      <w:pPr>
-        <w:numPr>
-          <w:ilvl w:val="0"/>
-          <w:numId w:val="1000"/>
-        </w:numPr>
-      </w:pPr>
-      <w:r>
-        <w:t xml:space="preserve">155</w:t>
-      </w:r>
-    </w:p>
-    <w:p>
-      <w:pPr>
-        <w:numPr>
-          <w:ilvl w:val="0"/>
-          <w:numId w:val="1000"/>
-        </w:numPr>
-      </w:pPr>
-      <w:r>
-        <w:t xml:space="preserve">19</w:t>
-      </w:r>
-    </w:p>
-    <w:p>
-      <w:pPr>
-        <w:numPr>
-          <w:ilvl w:val="0"/>
-          <w:numId w:val="1000"/>
-        </w:numPr>
-      </w:pPr>
-      <w:r>
-        <w:t xml:space="preserve">155</w:t>
-      </w:r>
-    </w:p>
-    <w:p>
-      <w:pPr>
-        <w:numPr>
-          <w:ilvl w:val="0"/>
-          <w:numId w:val="1000"/>
-        </w:numPr>
-      </w:pPr>
-      <w:r>
-        <w:t xml:space="preserve">20</w:t>
-      </w:r>
-    </w:p>
-    <w:p>
-      <w:pPr>
-        <w:numPr>
-          <w:ilvl w:val="0"/>
-          <w:numId w:val="1000"/>
-        </w:numPr>
-      </w:pPr>
-      <w:r>
-        <w:t xml:space="preserve">186</w:t>
-      </w:r>
-    </w:p>
-    <w:p>
-      <w:pPr>
-        <w:numPr>
-          <w:ilvl w:val="0"/>
-          <w:numId w:val="1000"/>
-        </w:numPr>
-      </w:pPr>
-      <w:r>
-        <w:t xml:space="preserve">21</w:t>
-      </w:r>
-    </w:p>
-    <w:p>
-      <w:pPr>
-        <w:numPr>
-          <w:ilvl w:val="0"/>
-          <w:numId w:val="1000"/>
-        </w:numPr>
-      </w:pPr>
-      <w:r>
-        <w:t xml:space="preserve">179</w:t>
       </w:r>
     </w:p>
     <w:p>
@@ -2162,7 +2162,7 @@
               <a:graphicData uri="http://schemas.openxmlformats.org/drawingml/2006/picture">
                 <pic:pic>
                   <pic:nvPicPr>
-                    <pic:cNvPr descr="media/supplements1/exercise3/DiagramaB-1.svg" id="62" name="Picture"/>
+                    <pic:cNvPr descr="media/supplements1/exercise3/DiagramaD-1.svg" id="62" name="Picture"/>
                     <pic:cNvPicPr>
                       <a:picLocks noChangeArrowheads="1" noChangeAspect="1"/>
                     </pic:cNvPicPr>
@@ -2221,7 +2221,7 @@
               <a:graphicData uri="http://schemas.openxmlformats.org/drawingml/2006/picture">
                 <pic:pic>
                   <pic:nvPicPr>
-                    <pic:cNvPr descr="media/supplements1/exercise3/DiagramaD-1.svg" id="66" name="Picture"/>
+                    <pic:cNvPr descr="media/supplements1/exercise3/DiagramaB-1.svg" id="66" name="Picture"/>
                     <pic:cNvPicPr>
                       <a:picLocks noChangeArrowheads="1" noChangeAspect="1"/>
                     </pic:cNvPicPr>
@@ -2280,7 +2280,7 @@
               <a:graphicData uri="http://schemas.openxmlformats.org/drawingml/2006/picture">
                 <pic:pic>
                   <pic:nvPicPr>
-                    <pic:cNvPr descr="media/supplements1/exercise3/DiagramaA-1.svg" id="70" name="Picture"/>
+                    <pic:cNvPr descr="media/supplements1/exercise3/DiagramaC-1.svg" id="70" name="Picture"/>
                     <pic:cNvPicPr>
                       <a:picLocks noChangeArrowheads="1" noChangeAspect="1"/>
                     </pic:cNvPicPr>
@@ -2339,7 +2339,7 @@
               <a:graphicData uri="http://schemas.openxmlformats.org/drawingml/2006/picture">
                 <pic:pic>
                   <pic:nvPicPr>
-                    <pic:cNvPr descr="media/supplements1/exercise3/DiagramaC-1.svg" id="74" name="Picture"/>
+                    <pic:cNvPr descr="media/supplements1/exercise3/DiagramaA-1.svg" id="74" name="Picture"/>
                     <pic:cNvPicPr>
                       <a:picLocks noChangeArrowheads="1" noChangeAspect="1"/>
                     </pic:cNvPicPr>
@@ -2410,7 +2410,7 @@
         </w:numPr>
       </w:pPr>
       <w:r>
-        <w:t xml:space="preserve">Mínimo: 154 cm</w:t>
+        <w:t xml:space="preserve">Mínimo: 152 cm</w:t>
       </w:r>
     </w:p>
     <w:p>
@@ -2421,7 +2421,7 @@
         </w:numPr>
       </w:pPr>
       <w:r>
-        <w:t xml:space="preserve">Q1: 166 cm</w:t>
+        <w:t xml:space="preserve">Q1: 162 cm</w:t>
       </w:r>
     </w:p>
     <w:p>
@@ -2432,7 +2432,7 @@
         </w:numPr>
       </w:pPr>
       <w:r>
-        <w:t xml:space="preserve">Mediana: 169 cm</w:t>
+        <w:t xml:space="preserve">Mediana: 168 cm</w:t>
       </w:r>
     </w:p>
     <w:p>
@@ -2443,7 +2443,7 @@
         </w:numPr>
       </w:pPr>
       <w:r>
-        <w:t xml:space="preserve">Q3: 177 cm</w:t>
+        <w:t xml:space="preserve">Q3: 171 cm</w:t>
       </w:r>
     </w:p>
     <w:p>
@@ -2454,7 +2454,7 @@
         </w:numPr>
       </w:pPr>
       <w:r>
-        <w:t xml:space="preserve">Máximo: 188 cm</w:t>
+        <w:t xml:space="preserve">Máximo: 178 cm</w:t>
       </w:r>
     </w:p>
     <w:p>
@@ -2524,6 +2524,17 @@
         </w:numPr>
       </w:pPr>
       <w:r>
+        <w:t xml:space="preserve">Incorrecto. La mediana está mal calculada.</w:t>
+      </w:r>
+    </w:p>
+    <w:p>
+      <w:pPr>
+        <w:numPr>
+          <w:ilvl w:val="1"/>
+          <w:numId w:val="1010"/>
+        </w:numPr>
+      </w:pPr>
+      <w:r>
         <w:t xml:space="preserve">Incorrecto. Los valores están multiplicados por 10.</w:t>
       </w:r>
     </w:p>
@@ -2535,7 +2546,7 @@
         </w:numPr>
       </w:pPr>
       <w:r>
-        <w:t xml:space="preserve">Incorrecto. La mediana está mal calculada.</w:t>
+        <w:t xml:space="preserve">Incorrecto. Los cuartiles Q1 y Q3 están invertidos.</w:t>
       </w:r>
     </w:p>
     <w:p>
@@ -2547,17 +2558,6 @@
       </w:pPr>
       <w:r>
         <w:t xml:space="preserve">Correcto. Este diagrama representa fielmente todos los valores estadísticos.</w:t>
-      </w:r>
-    </w:p>
-    <w:p>
-      <w:pPr>
-        <w:numPr>
-          <w:ilvl w:val="1"/>
-          <w:numId w:val="1010"/>
-        </w:numPr>
-      </w:pPr>
-      <w:r>
-        <w:t xml:space="preserve">Incorrecto. Los cuartiles Q1 y Q3 están invertidos.</w:t>
       </w:r>
     </w:p>
     <w:p>
@@ -2622,6 +2622,336 @@
         </w:numPr>
       </w:pPr>
       <w:r>
+        <w:t xml:space="preserve">174</w:t>
+      </w:r>
+    </w:p>
+    <w:p>
+      <w:pPr>
+        <w:numPr>
+          <w:ilvl w:val="0"/>
+          <w:numId w:val="1000"/>
+        </w:numPr>
+      </w:pPr>
+      <w:r>
+        <w:t xml:space="preserve">2</w:t>
+      </w:r>
+    </w:p>
+    <w:p>
+      <w:pPr>
+        <w:numPr>
+          <w:ilvl w:val="0"/>
+          <w:numId w:val="1000"/>
+        </w:numPr>
+      </w:pPr>
+      <w:r>
+        <w:t xml:space="preserve">155</w:t>
+      </w:r>
+    </w:p>
+    <w:p>
+      <w:pPr>
+        <w:numPr>
+          <w:ilvl w:val="0"/>
+          <w:numId w:val="1000"/>
+        </w:numPr>
+      </w:pPr>
+      <w:r>
+        <w:t xml:space="preserve">3</w:t>
+      </w:r>
+    </w:p>
+    <w:p>
+      <w:pPr>
+        <w:numPr>
+          <w:ilvl w:val="0"/>
+          <w:numId w:val="1000"/>
+        </w:numPr>
+      </w:pPr>
+      <w:r>
+        <w:t xml:space="preserve">162</w:t>
+      </w:r>
+    </w:p>
+    <w:p>
+      <w:pPr>
+        <w:numPr>
+          <w:ilvl w:val="0"/>
+          <w:numId w:val="1000"/>
+        </w:numPr>
+      </w:pPr>
+      <w:r>
+        <w:t xml:space="preserve">4</w:t>
+      </w:r>
+    </w:p>
+    <w:p>
+      <w:pPr>
+        <w:numPr>
+          <w:ilvl w:val="0"/>
+          <w:numId w:val="1000"/>
+        </w:numPr>
+      </w:pPr>
+      <w:r>
+        <w:t xml:space="preserve">175</w:t>
+      </w:r>
+    </w:p>
+    <w:p>
+      <w:pPr>
+        <w:numPr>
+          <w:ilvl w:val="0"/>
+          <w:numId w:val="1000"/>
+        </w:numPr>
+      </w:pPr>
+      <w:r>
+        <w:t xml:space="preserve">5</w:t>
+      </w:r>
+    </w:p>
+    <w:p>
+      <w:pPr>
+        <w:numPr>
+          <w:ilvl w:val="0"/>
+          <w:numId w:val="1000"/>
+        </w:numPr>
+      </w:pPr>
+      <w:r>
+        <w:t xml:space="preserve">164</w:t>
+      </w:r>
+    </w:p>
+    <w:p>
+      <w:pPr>
+        <w:numPr>
+          <w:ilvl w:val="0"/>
+          <w:numId w:val="1000"/>
+        </w:numPr>
+      </w:pPr>
+      <w:r>
+        <w:t xml:space="preserve">6</w:t>
+      </w:r>
+    </w:p>
+    <w:p>
+      <w:pPr>
+        <w:numPr>
+          <w:ilvl w:val="0"/>
+          <w:numId w:val="1000"/>
+        </w:numPr>
+      </w:pPr>
+      <w:r>
+        <w:t xml:space="preserve">156</w:t>
+      </w:r>
+    </w:p>
+    <w:p>
+      <w:pPr>
+        <w:numPr>
+          <w:ilvl w:val="0"/>
+          <w:numId w:val="1000"/>
+        </w:numPr>
+      </w:pPr>
+      <w:r>
+        <w:t xml:space="preserve">7</w:t>
+      </w:r>
+    </w:p>
+    <w:p>
+      <w:pPr>
+        <w:numPr>
+          <w:ilvl w:val="0"/>
+          <w:numId w:val="1000"/>
+        </w:numPr>
+      </w:pPr>
+      <w:r>
+        <w:t xml:space="preserve">154</w:t>
+      </w:r>
+    </w:p>
+    <w:p>
+      <w:pPr>
+        <w:numPr>
+          <w:ilvl w:val="0"/>
+          <w:numId w:val="1000"/>
+        </w:numPr>
+      </w:pPr>
+      <w:r>
+        <w:t xml:space="preserve">8</w:t>
+      </w:r>
+    </w:p>
+    <w:p>
+      <w:pPr>
+        <w:numPr>
+          <w:ilvl w:val="0"/>
+          <w:numId w:val="1000"/>
+        </w:numPr>
+      </w:pPr>
+      <w:r>
+        <w:t xml:space="preserve">173</w:t>
+      </w:r>
+    </w:p>
+    <w:p>
+      <w:pPr>
+        <w:numPr>
+          <w:ilvl w:val="0"/>
+          <w:numId w:val="1000"/>
+        </w:numPr>
+      </w:pPr>
+      <w:r>
+        <w:t xml:space="preserve">9</w:t>
+      </w:r>
+    </w:p>
+    <w:p>
+      <w:pPr>
+        <w:numPr>
+          <w:ilvl w:val="0"/>
+          <w:numId w:val="1000"/>
+        </w:numPr>
+      </w:pPr>
+      <w:r>
+        <w:t xml:space="preserve">166</w:t>
+      </w:r>
+    </w:p>
+    <w:p>
+      <w:pPr>
+        <w:numPr>
+          <w:ilvl w:val="0"/>
+          <w:numId w:val="1000"/>
+        </w:numPr>
+      </w:pPr>
+      <w:r>
+        <w:t xml:space="preserve">10</w:t>
+      </w:r>
+    </w:p>
+    <w:p>
+      <w:pPr>
+        <w:numPr>
+          <w:ilvl w:val="0"/>
+          <w:numId w:val="1000"/>
+        </w:numPr>
+      </w:pPr>
+      <w:r>
+        <w:t xml:space="preserve">170</w:t>
+      </w:r>
+    </w:p>
+    <w:p>
+      <w:pPr>
+        <w:numPr>
+          <w:ilvl w:val="0"/>
+          <w:numId w:val="1000"/>
+        </w:numPr>
+      </w:pPr>
+      <w:r>
+        <w:t xml:space="preserve">11</w:t>
+      </w:r>
+    </w:p>
+    <w:p>
+      <w:pPr>
+        <w:numPr>
+          <w:ilvl w:val="0"/>
+          <w:numId w:val="1000"/>
+        </w:numPr>
+      </w:pPr>
+      <w:r>
+        <w:t xml:space="preserve">158</w:t>
+      </w:r>
+    </w:p>
+    <w:p>
+      <w:pPr>
+        <w:numPr>
+          <w:ilvl w:val="0"/>
+          <w:numId w:val="1000"/>
+        </w:numPr>
+      </w:pPr>
+      <w:r>
+        <w:t xml:space="preserve">12</w:t>
+      </w:r>
+    </w:p>
+    <w:p>
+      <w:pPr>
+        <w:numPr>
+          <w:ilvl w:val="0"/>
+          <w:numId w:val="1000"/>
+        </w:numPr>
+      </w:pPr>
+      <w:r>
+        <w:t xml:space="preserve">167</w:t>
+      </w:r>
+    </w:p>
+    <w:p>
+      <w:pPr>
+        <w:numPr>
+          <w:ilvl w:val="0"/>
+          <w:numId w:val="1000"/>
+        </w:numPr>
+      </w:pPr>
+      <w:r>
+        <w:t xml:space="preserve">13</w:t>
+      </w:r>
+    </w:p>
+    <w:p>
+      <w:pPr>
+        <w:numPr>
+          <w:ilvl w:val="0"/>
+          <w:numId w:val="1000"/>
+        </w:numPr>
+      </w:pPr>
+      <w:r>
+        <w:t xml:space="preserve">171</w:t>
+      </w:r>
+    </w:p>
+    <w:p>
+      <w:pPr>
+        <w:numPr>
+          <w:ilvl w:val="0"/>
+          <w:numId w:val="1000"/>
+        </w:numPr>
+      </w:pPr>
+      <w:r>
+        <w:t xml:space="preserve">14</w:t>
+      </w:r>
+    </w:p>
+    <w:p>
+      <w:pPr>
+        <w:numPr>
+          <w:ilvl w:val="0"/>
+          <w:numId w:val="1000"/>
+        </w:numPr>
+      </w:pPr>
+      <w:r>
+        <w:t xml:space="preserve">175</w:t>
+      </w:r>
+    </w:p>
+    <w:p>
+      <w:pPr>
+        <w:numPr>
+          <w:ilvl w:val="0"/>
+          <w:numId w:val="1000"/>
+        </w:numPr>
+      </w:pPr>
+      <w:r>
+        <w:t xml:space="preserve">15</w:t>
+      </w:r>
+    </w:p>
+    <w:p>
+      <w:pPr>
+        <w:numPr>
+          <w:ilvl w:val="0"/>
+          <w:numId w:val="1000"/>
+        </w:numPr>
+      </w:pPr>
+      <w:r>
+        <w:t xml:space="preserve">171</w:t>
+      </w:r>
+    </w:p>
+    <w:p>
+      <w:pPr>
+        <w:numPr>
+          <w:ilvl w:val="0"/>
+          <w:numId w:val="1000"/>
+        </w:numPr>
+      </w:pPr>
+      <w:r>
+        <w:t xml:space="preserve">16</w:t>
+      </w:r>
+    </w:p>
+    <w:p>
+      <w:pPr>
+        <w:numPr>
+          <w:ilvl w:val="0"/>
+          <w:numId w:val="1000"/>
+        </w:numPr>
+      </w:pPr>
+      <w:r>
         <w:t xml:space="preserve">149</w:t>
       </w:r>
     </w:p>
@@ -2633,95 +2963,117 @@
         </w:numPr>
       </w:pPr>
       <w:r>
-        <w:t xml:space="preserve">2</w:t>
-      </w:r>
-    </w:p>
-    <w:p>
-      <w:pPr>
-        <w:numPr>
-          <w:ilvl w:val="0"/>
-          <w:numId w:val="1000"/>
-        </w:numPr>
-      </w:pPr>
-      <w:r>
-        <w:t xml:space="preserve">188</w:t>
-      </w:r>
-    </w:p>
-    <w:p>
-      <w:pPr>
-        <w:numPr>
-          <w:ilvl w:val="0"/>
-          <w:numId w:val="1000"/>
-        </w:numPr>
-      </w:pPr>
-      <w:r>
-        <w:t xml:space="preserve">3</w:t>
-      </w:r>
-    </w:p>
-    <w:p>
-      <w:pPr>
-        <w:numPr>
-          <w:ilvl w:val="0"/>
-          <w:numId w:val="1000"/>
-        </w:numPr>
-      </w:pPr>
-      <w:r>
-        <w:t xml:space="preserve">152</w:t>
-      </w:r>
-    </w:p>
-    <w:p>
-      <w:pPr>
-        <w:numPr>
-          <w:ilvl w:val="0"/>
-          <w:numId w:val="1000"/>
-        </w:numPr>
-      </w:pPr>
-      <w:r>
-        <w:t xml:space="preserve">4</w:t>
-      </w:r>
-    </w:p>
-    <w:p>
-      <w:pPr>
-        <w:numPr>
-          <w:ilvl w:val="0"/>
-          <w:numId w:val="1000"/>
-        </w:numPr>
-      </w:pPr>
-      <w:r>
-        <w:t xml:space="preserve">186</w:t>
-      </w:r>
-    </w:p>
-    <w:p>
-      <w:pPr>
-        <w:numPr>
-          <w:ilvl w:val="0"/>
-          <w:numId w:val="1000"/>
-        </w:numPr>
-      </w:pPr>
-      <w:r>
-        <w:t xml:space="preserve">5</w:t>
-      </w:r>
-    </w:p>
-    <w:p>
-      <w:pPr>
-        <w:numPr>
-          <w:ilvl w:val="0"/>
-          <w:numId w:val="1000"/>
-        </w:numPr>
-      </w:pPr>
-      <w:r>
-        <w:t xml:space="preserve">157</w:t>
-      </w:r>
-    </w:p>
-    <w:p>
-      <w:pPr>
-        <w:numPr>
-          <w:ilvl w:val="0"/>
-          <w:numId w:val="1000"/>
-        </w:numPr>
-      </w:pPr>
-      <w:r>
-        <w:t xml:space="preserve">6</w:t>
+        <w:t xml:space="preserve">17</w:t>
+      </w:r>
+    </w:p>
+    <w:p>
+      <w:pPr>
+        <w:numPr>
+          <w:ilvl w:val="0"/>
+          <w:numId w:val="1000"/>
+        </w:numPr>
+      </w:pPr>
+      <w:r>
+        <w:t xml:space="preserve">171</w:t>
+      </w:r>
+    </w:p>
+    <w:p>
+      <w:pPr>
+        <w:numPr>
+          <w:ilvl w:val="0"/>
+          <w:numId w:val="1000"/>
+        </w:numPr>
+      </w:pPr>
+      <w:r>
+        <w:t xml:space="preserve">18</w:t>
+      </w:r>
+    </w:p>
+    <w:p>
+      <w:pPr>
+        <w:numPr>
+          <w:ilvl w:val="0"/>
+          <w:numId w:val="1000"/>
+        </w:numPr>
+      </w:pPr>
+      <w:r>
+        <w:t xml:space="preserve">175</w:t>
+      </w:r>
+    </w:p>
+    <w:p>
+      <w:pPr>
+        <w:numPr>
+          <w:ilvl w:val="0"/>
+          <w:numId w:val="1000"/>
+        </w:numPr>
+      </w:pPr>
+      <w:r>
+        <w:t xml:space="preserve">19</w:t>
+      </w:r>
+    </w:p>
+    <w:p>
+      <w:pPr>
+        <w:numPr>
+          <w:ilvl w:val="0"/>
+          <w:numId w:val="1000"/>
+        </w:numPr>
+      </w:pPr>
+      <w:r>
+        <w:t xml:space="preserve">151</w:t>
+      </w:r>
+    </w:p>
+    <w:p>
+      <w:pPr>
+        <w:numPr>
+          <w:ilvl w:val="0"/>
+          <w:numId w:val="1000"/>
+        </w:numPr>
+      </w:pPr>
+      <w:r>
+        <w:t xml:space="preserve">20</w:t>
+      </w:r>
+    </w:p>
+    <w:p>
+      <w:pPr>
+        <w:numPr>
+          <w:ilvl w:val="0"/>
+          <w:numId w:val="1000"/>
+        </w:numPr>
+      </w:pPr>
+      <w:r>
+        <w:t xml:space="preserve">172</w:t>
+      </w:r>
+    </w:p>
+    <w:p>
+      <w:pPr>
+        <w:numPr>
+          <w:ilvl w:val="0"/>
+          <w:numId w:val="1000"/>
+        </w:numPr>
+      </w:pPr>
+      <w:r>
+        <w:t xml:space="preserve">21</w:t>
+      </w:r>
+    </w:p>
+    <w:p>
+      <w:pPr>
+        <w:numPr>
+          <w:ilvl w:val="0"/>
+          <w:numId w:val="1000"/>
+        </w:numPr>
+      </w:pPr>
+      <w:r>
+        <w:t xml:space="preserve">150</w:t>
+      </w:r>
+    </w:p>
+    <w:p>
+      <w:pPr>
+        <w:numPr>
+          <w:ilvl w:val="0"/>
+          <w:numId w:val="1000"/>
+        </w:numPr>
+      </w:pPr>
+      <w:r>
+        <w:t xml:space="preserve">22</w:t>
       </w:r>
     </w:p>
     <w:p>
@@ -2743,315 +3095,29 @@
         </w:numPr>
       </w:pPr>
       <w:r>
-        <w:t xml:space="preserve">7</w:t>
-      </w:r>
-    </w:p>
-    <w:p>
-      <w:pPr>
-        <w:numPr>
-          <w:ilvl w:val="0"/>
-          <w:numId w:val="1000"/>
-        </w:numPr>
-      </w:pPr>
-      <w:r>
-        <w:t xml:space="preserve">150</w:t>
-      </w:r>
-    </w:p>
-    <w:p>
-      <w:pPr>
-        <w:numPr>
-          <w:ilvl w:val="0"/>
-          <w:numId w:val="1000"/>
-        </w:numPr>
-      </w:pPr>
-      <w:r>
-        <w:t xml:space="preserve">8</w:t>
-      </w:r>
-    </w:p>
-    <w:p>
-      <w:pPr>
-        <w:numPr>
-          <w:ilvl w:val="0"/>
-          <w:numId w:val="1000"/>
-        </w:numPr>
-      </w:pPr>
-      <w:r>
-        <w:t xml:space="preserve">184</w:t>
-      </w:r>
-    </w:p>
-    <w:p>
-      <w:pPr>
-        <w:numPr>
-          <w:ilvl w:val="0"/>
-          <w:numId w:val="1000"/>
-        </w:numPr>
-      </w:pPr>
-      <w:r>
-        <w:t xml:space="preserve">9</w:t>
-      </w:r>
-    </w:p>
-    <w:p>
-      <w:pPr>
-        <w:numPr>
-          <w:ilvl w:val="0"/>
-          <w:numId w:val="1000"/>
-        </w:numPr>
-      </w:pPr>
-      <w:r>
-        <w:t xml:space="preserve">168</w:t>
-      </w:r>
-    </w:p>
-    <w:p>
-      <w:pPr>
-        <w:numPr>
-          <w:ilvl w:val="0"/>
-          <w:numId w:val="1000"/>
-        </w:numPr>
-      </w:pPr>
-      <w:r>
-        <w:t xml:space="preserve">10</w:t>
-      </w:r>
-    </w:p>
-    <w:p>
-      <w:pPr>
-        <w:numPr>
-          <w:ilvl w:val="0"/>
-          <w:numId w:val="1000"/>
-        </w:numPr>
-      </w:pPr>
-      <w:r>
-        <w:t xml:space="preserve">188</w:t>
-      </w:r>
-    </w:p>
-    <w:p>
-      <w:pPr>
-        <w:numPr>
-          <w:ilvl w:val="0"/>
-          <w:numId w:val="1000"/>
-        </w:numPr>
-      </w:pPr>
-      <w:r>
-        <w:t xml:space="preserve">11</w:t>
-      </w:r>
-    </w:p>
-    <w:p>
-      <w:pPr>
-        <w:numPr>
-          <w:ilvl w:val="0"/>
-          <w:numId w:val="1000"/>
-        </w:numPr>
-      </w:pPr>
-      <w:r>
-        <w:t xml:space="preserve">174</w:t>
-      </w:r>
-    </w:p>
-    <w:p>
-      <w:pPr>
-        <w:numPr>
-          <w:ilvl w:val="0"/>
-          <w:numId w:val="1000"/>
-        </w:numPr>
-      </w:pPr>
-      <w:r>
-        <w:t xml:space="preserve">12</w:t>
-      </w:r>
-    </w:p>
-    <w:p>
-      <w:pPr>
-        <w:numPr>
-          <w:ilvl w:val="0"/>
-          <w:numId w:val="1000"/>
-        </w:numPr>
-      </w:pPr>
-      <w:r>
-        <w:t xml:space="preserve">152</w:t>
-      </w:r>
-    </w:p>
-    <w:p>
-      <w:pPr>
-        <w:numPr>
-          <w:ilvl w:val="0"/>
-          <w:numId w:val="1000"/>
-        </w:numPr>
-      </w:pPr>
-      <w:r>
-        <w:t xml:space="preserve">13</w:t>
-      </w:r>
-    </w:p>
-    <w:p>
-      <w:pPr>
-        <w:numPr>
-          <w:ilvl w:val="0"/>
-          <w:numId w:val="1000"/>
-        </w:numPr>
-      </w:pPr>
-      <w:r>
-        <w:t xml:space="preserve">171</w:t>
-      </w:r>
-    </w:p>
-    <w:p>
-      <w:pPr>
-        <w:numPr>
-          <w:ilvl w:val="0"/>
-          <w:numId w:val="1000"/>
-        </w:numPr>
-      </w:pPr>
-      <w:r>
-        <w:t xml:space="preserve">14</w:t>
-      </w:r>
-    </w:p>
-    <w:p>
-      <w:pPr>
-        <w:numPr>
-          <w:ilvl w:val="0"/>
-          <w:numId w:val="1000"/>
-        </w:numPr>
-      </w:pPr>
-      <w:r>
-        <w:t xml:space="preserve">180</w:t>
-      </w:r>
-    </w:p>
-    <w:p>
-      <w:pPr>
-        <w:numPr>
-          <w:ilvl w:val="0"/>
-          <w:numId w:val="1000"/>
-        </w:numPr>
-      </w:pPr>
-      <w:r>
-        <w:t xml:space="preserve">15</w:t>
-      </w:r>
-    </w:p>
-    <w:p>
-      <w:pPr>
-        <w:numPr>
-          <w:ilvl w:val="0"/>
-          <w:numId w:val="1000"/>
-        </w:numPr>
-      </w:pPr>
-      <w:r>
-        <w:t xml:space="preserve">178</w:t>
-      </w:r>
-    </w:p>
-    <w:p>
-      <w:pPr>
-        <w:numPr>
-          <w:ilvl w:val="0"/>
-          <w:numId w:val="1000"/>
-        </w:numPr>
-      </w:pPr>
-      <w:r>
-        <w:t xml:space="preserve">16</w:t>
-      </w:r>
-    </w:p>
-    <w:p>
-      <w:pPr>
-        <w:numPr>
-          <w:ilvl w:val="0"/>
-          <w:numId w:val="1000"/>
-        </w:numPr>
-      </w:pPr>
-      <w:r>
-        <w:t xml:space="preserve">161</w:t>
-      </w:r>
-    </w:p>
-    <w:p>
-      <w:pPr>
-        <w:numPr>
-          <w:ilvl w:val="0"/>
-          <w:numId w:val="1000"/>
-        </w:numPr>
-      </w:pPr>
-      <w:r>
-        <w:t xml:space="preserve">17</w:t>
-      </w:r>
-    </w:p>
-    <w:p>
-      <w:pPr>
-        <w:numPr>
-          <w:ilvl w:val="0"/>
-          <w:numId w:val="1000"/>
-        </w:numPr>
-      </w:pPr>
-      <w:r>
-        <w:t xml:space="preserve">162</w:t>
-      </w:r>
-    </w:p>
-    <w:p>
-      <w:pPr>
-        <w:numPr>
-          <w:ilvl w:val="0"/>
-          <w:numId w:val="1000"/>
-        </w:numPr>
-      </w:pPr>
-      <w:r>
-        <w:t xml:space="preserve">18</w:t>
-      </w:r>
-    </w:p>
-    <w:p>
-      <w:pPr>
-        <w:numPr>
-          <w:ilvl w:val="0"/>
-          <w:numId w:val="1000"/>
-        </w:numPr>
-      </w:pPr>
-      <w:r>
-        <w:t xml:space="preserve">189</w:t>
-      </w:r>
-    </w:p>
-    <w:p>
-      <w:pPr>
-        <w:numPr>
-          <w:ilvl w:val="0"/>
-          <w:numId w:val="1000"/>
-        </w:numPr>
-      </w:pPr>
-      <w:r>
-        <w:t xml:space="preserve">19</w:t>
-      </w:r>
-    </w:p>
-    <w:p>
-      <w:pPr>
-        <w:numPr>
-          <w:ilvl w:val="0"/>
-          <w:numId w:val="1000"/>
-        </w:numPr>
-      </w:pPr>
-      <w:r>
-        <w:t xml:space="preserve">155</w:t>
-      </w:r>
-    </w:p>
-    <w:p>
-      <w:pPr>
-        <w:numPr>
-          <w:ilvl w:val="0"/>
-          <w:numId w:val="1000"/>
-        </w:numPr>
-      </w:pPr>
-      <w:r>
-        <w:t xml:space="preserve">20</w:t>
-      </w:r>
-    </w:p>
-    <w:p>
-      <w:pPr>
-        <w:numPr>
-          <w:ilvl w:val="0"/>
-          <w:numId w:val="1000"/>
-        </w:numPr>
-      </w:pPr>
-      <w:r>
-        <w:t xml:space="preserve">162</w:t>
-      </w:r>
-    </w:p>
-    <w:p>
-      <w:pPr>
-        <w:numPr>
-          <w:ilvl w:val="0"/>
-          <w:numId w:val="1000"/>
-        </w:numPr>
-      </w:pPr>
-      <w:r>
-        <w:t xml:space="preserve">21</w:t>
+        <w:t xml:space="preserve">23</w:t>
+      </w:r>
+    </w:p>
+    <w:p>
+      <w:pPr>
+        <w:numPr>
+          <w:ilvl w:val="0"/>
+          <w:numId w:val="1000"/>
+        </w:numPr>
+      </w:pPr>
+      <w:r>
+        <w:t xml:space="preserve">151</w:t>
+      </w:r>
+    </w:p>
+    <w:p>
+      <w:pPr>
+        <w:numPr>
+          <w:ilvl w:val="0"/>
+          <w:numId w:val="1000"/>
+        </w:numPr>
+      </w:pPr>
+      <w:r>
+        <w:t xml:space="preserve">24</w:t>
       </w:r>
     </w:p>
     <w:p>
@@ -3063,6 +3129,28 @@
       </w:pPr>
       <w:r>
         <w:t xml:space="preserve">156</w:t>
+      </w:r>
+    </w:p>
+    <w:p>
+      <w:pPr>
+        <w:numPr>
+          <w:ilvl w:val="0"/>
+          <w:numId w:val="1000"/>
+        </w:numPr>
+      </w:pPr>
+      <w:r>
+        <w:t xml:space="preserve">25</w:t>
+      </w:r>
+    </w:p>
+    <w:p>
+      <w:pPr>
+        <w:numPr>
+          <w:ilvl w:val="0"/>
+          <w:numId w:val="1000"/>
+        </w:numPr>
+      </w:pPr>
+      <w:r>
+        <w:t xml:space="preserve">181</w:t>
       </w:r>
     </w:p>
     <w:p>
@@ -3093,7 +3181,7 @@
               <a:graphicData uri="http://schemas.openxmlformats.org/drawingml/2006/picture">
                 <pic:pic>
                   <pic:nvPicPr>
-                    <pic:cNvPr descr="media/supplements1/exercise4/DiagramaA-1.svg" id="82" name="Picture"/>
+                    <pic:cNvPr descr="media/supplements1/exercise4/DiagramaB-1.svg" id="82" name="Picture"/>
                     <pic:cNvPicPr>
                       <a:picLocks noChangeArrowheads="1" noChangeAspect="1"/>
                     </pic:cNvPicPr>
@@ -3152,7 +3240,7 @@
               <a:graphicData uri="http://schemas.openxmlformats.org/drawingml/2006/picture">
                 <pic:pic>
                   <pic:nvPicPr>
-                    <pic:cNvPr descr="media/supplements1/exercise4/DiagramaD-1.svg" id="86" name="Picture"/>
+                    <pic:cNvPr descr="media/supplements1/exercise4/DiagramaC-1.svg" id="86" name="Picture"/>
                     <pic:cNvPicPr>
                       <a:picLocks noChangeArrowheads="1" noChangeAspect="1"/>
                     </pic:cNvPicPr>
@@ -3211,7 +3299,7 @@
               <a:graphicData uri="http://schemas.openxmlformats.org/drawingml/2006/picture">
                 <pic:pic>
                   <pic:nvPicPr>
-                    <pic:cNvPr descr="media/supplements1/exercise4/DiagramaC-1.svg" id="90" name="Picture"/>
+                    <pic:cNvPr descr="media/supplements1/exercise4/DiagramaA-1.svg" id="90" name="Picture"/>
                     <pic:cNvPicPr>
                       <a:picLocks noChangeArrowheads="1" noChangeAspect="1"/>
                     </pic:cNvPicPr>
@@ -3270,7 +3358,7 @@
               <a:graphicData uri="http://schemas.openxmlformats.org/drawingml/2006/picture">
                 <pic:pic>
                   <pic:nvPicPr>
-                    <pic:cNvPr descr="media/supplements1/exercise4/DiagramaB-1.svg" id="94" name="Picture"/>
+                    <pic:cNvPr descr="media/supplements1/exercise4/DiagramaD-1.svg" id="94" name="Picture"/>
                     <pic:cNvPicPr>
                       <a:picLocks noChangeArrowheads="1" noChangeAspect="1"/>
                     </pic:cNvPicPr>
@@ -3363,7 +3451,7 @@
         </w:numPr>
       </w:pPr>
       <w:r>
-        <w:t xml:space="preserve">Mediana: 168 cm</w:t>
+        <w:t xml:space="preserve">Mediana: 167 cm</w:t>
       </w:r>
     </w:p>
     <w:p>
@@ -3374,7 +3462,7 @@
         </w:numPr>
       </w:pPr>
       <w:r>
-        <w:t xml:space="preserve">Q3: 180 cm</w:t>
+        <w:t xml:space="preserve">Q3: 172 cm</w:t>
       </w:r>
     </w:p>
     <w:p>
@@ -3385,7 +3473,7 @@
         </w:numPr>
       </w:pPr>
       <w:r>
-        <w:t xml:space="preserve">Máximo: 189 cm</w:t>
+        <w:t xml:space="preserve">Máximo: 181 cm</w:t>
       </w:r>
     </w:p>
     <w:p>
@@ -3455,6 +3543,28 @@
         </w:numPr>
       </w:pPr>
       <w:r>
+        <w:t xml:space="preserve">Incorrecto. Los valores están multiplicados por 10.</w:t>
+      </w:r>
+    </w:p>
+    <w:p>
+      <w:pPr>
+        <w:numPr>
+          <w:ilvl w:val="1"/>
+          <w:numId w:val="1013"/>
+        </w:numPr>
+      </w:pPr>
+      <w:r>
+        <w:t xml:space="preserve">Incorrecto. Los cuartiles Q1 y Q3 están invertidos.</w:t>
+      </w:r>
+    </w:p>
+    <w:p>
+      <w:pPr>
+        <w:numPr>
+          <w:ilvl w:val="1"/>
+          <w:numId w:val="1013"/>
+        </w:numPr>
+      </w:pPr>
+      <w:r>
         <w:t xml:space="preserve">Correcto. Este diagrama representa fielmente todos los valores estadísticos.</w:t>
       </w:r>
     </w:p>
@@ -3467,28 +3577,6 @@
       </w:pPr>
       <w:r>
         <w:t xml:space="preserve">Incorrecto. La mediana está mal calculada.</w:t>
-      </w:r>
-    </w:p>
-    <w:p>
-      <w:pPr>
-        <w:numPr>
-          <w:ilvl w:val="1"/>
-          <w:numId w:val="1013"/>
-        </w:numPr>
-      </w:pPr>
-      <w:r>
-        <w:t xml:space="preserve">Incorrecto. Los cuartiles Q1 y Q3 están invertidos.</w:t>
-      </w:r>
-    </w:p>
-    <w:p>
-      <w:pPr>
-        <w:numPr>
-          <w:ilvl w:val="1"/>
-          <w:numId w:val="1013"/>
-        </w:numPr>
-      </w:pPr>
-      <w:r>
-        <w:t xml:space="preserve">Incorrecto. Los valores están multiplicados por 10.</w:t>
       </w:r>
     </w:p>
     <w:p>
@@ -3553,7 +3641,7 @@
         </w:numPr>
       </w:pPr>
       <w:r>
-        <w:t xml:space="preserve">189</w:t>
+        <w:t xml:space="preserve">164</w:t>
       </w:r>
     </w:p>
     <w:p>
@@ -3575,7 +3663,7 @@
         </w:numPr>
       </w:pPr>
       <w:r>
-        <w:t xml:space="preserve">163</w:t>
+        <w:t xml:space="preserve">171</w:t>
       </w:r>
     </w:p>
     <w:p>
@@ -3597,7 +3685,7 @@
         </w:numPr>
       </w:pPr>
       <w:r>
-        <w:t xml:space="preserve">178</w:t>
+        <w:t xml:space="preserve">149</w:t>
       </w:r>
     </w:p>
     <w:p>
@@ -3619,7 +3707,7 @@
         </w:numPr>
       </w:pPr>
       <w:r>
-        <w:t xml:space="preserve">191</w:t>
+        <w:t xml:space="preserve">173</w:t>
       </w:r>
     </w:p>
     <w:p>
@@ -3641,7 +3729,7 @@
         </w:numPr>
       </w:pPr>
       <w:r>
-        <w:t xml:space="preserve">185</w:t>
+        <w:t xml:space="preserve">167</w:t>
       </w:r>
     </w:p>
     <w:p>
@@ -3663,7 +3751,7 @@
         </w:numPr>
       </w:pPr>
       <w:r>
-        <w:t xml:space="preserve">174</w:t>
+        <w:t xml:space="preserve">151</w:t>
       </w:r>
     </w:p>
     <w:p>
@@ -3685,7 +3773,7 @@
         </w:numPr>
       </w:pPr>
       <w:r>
-        <w:t xml:space="preserve">186</w:t>
+        <w:t xml:space="preserve">162</w:t>
       </w:r>
     </w:p>
     <w:p>
@@ -3707,7 +3795,7 @@
         </w:numPr>
       </w:pPr>
       <w:r>
-        <w:t xml:space="preserve">182</w:t>
+        <w:t xml:space="preserve">165</w:t>
       </w:r>
     </w:p>
     <w:p>
@@ -3729,7 +3817,7 @@
         </w:numPr>
       </w:pPr>
       <w:r>
-        <w:t xml:space="preserve">160</w:t>
+        <w:t xml:space="preserve">164</w:t>
       </w:r>
     </w:p>
     <w:p>
@@ -3751,7 +3839,7 @@
         </w:numPr>
       </w:pPr>
       <w:r>
-        <w:t xml:space="preserve">158</w:t>
+        <w:t xml:space="preserve">164</w:t>
       </w:r>
     </w:p>
     <w:p>
@@ -3773,7 +3861,7 @@
         </w:numPr>
       </w:pPr>
       <w:r>
-        <w:t xml:space="preserve">160</w:t>
+        <w:t xml:space="preserve">157</w:t>
       </w:r>
     </w:p>
     <w:p>
@@ -3795,7 +3883,7 @@
         </w:numPr>
       </w:pPr>
       <w:r>
-        <w:t xml:space="preserve">157</w:t>
+        <w:t xml:space="preserve">144</w:t>
       </w:r>
     </w:p>
     <w:p>
@@ -3817,7 +3905,7 @@
         </w:numPr>
       </w:pPr>
       <w:r>
-        <w:t xml:space="preserve">189</w:t>
+        <w:t xml:space="preserve">154</w:t>
       </w:r>
     </w:p>
     <w:p>
@@ -3839,7 +3927,7 @@
         </w:numPr>
       </w:pPr>
       <w:r>
-        <w:t xml:space="preserve">166</w:t>
+        <w:t xml:space="preserve">145</w:t>
       </w:r>
     </w:p>
     <w:p>
@@ -3861,139 +3949,7 @@
         </w:numPr>
       </w:pPr>
       <w:r>
-        <w:t xml:space="preserve">169</w:t>
-      </w:r>
-    </w:p>
-    <w:p>
-      <w:pPr>
-        <w:numPr>
-          <w:ilvl w:val="0"/>
-          <w:numId w:val="1000"/>
-        </w:numPr>
-      </w:pPr>
-      <w:r>
-        <w:t xml:space="preserve">16</w:t>
-      </w:r>
-    </w:p>
-    <w:p>
-      <w:pPr>
-        <w:numPr>
-          <w:ilvl w:val="0"/>
-          <w:numId w:val="1000"/>
-        </w:numPr>
-      </w:pPr>
-      <w:r>
-        <w:t xml:space="preserve">186</w:t>
-      </w:r>
-    </w:p>
-    <w:p>
-      <w:pPr>
-        <w:numPr>
-          <w:ilvl w:val="0"/>
-          <w:numId w:val="1000"/>
-        </w:numPr>
-      </w:pPr>
-      <w:r>
-        <w:t xml:space="preserve">17</w:t>
-      </w:r>
-    </w:p>
-    <w:p>
-      <w:pPr>
-        <w:numPr>
-          <w:ilvl w:val="0"/>
-          <w:numId w:val="1000"/>
-        </w:numPr>
-      </w:pPr>
-      <w:r>
-        <w:t xml:space="preserve">163</w:t>
-      </w:r>
-    </w:p>
-    <w:p>
-      <w:pPr>
-        <w:numPr>
-          <w:ilvl w:val="0"/>
-          <w:numId w:val="1000"/>
-        </w:numPr>
-      </w:pPr>
-      <w:r>
-        <w:t xml:space="preserve">18</w:t>
-      </w:r>
-    </w:p>
-    <w:p>
-      <w:pPr>
-        <w:numPr>
-          <w:ilvl w:val="0"/>
-          <w:numId w:val="1000"/>
-        </w:numPr>
-      </w:pPr>
-      <w:r>
-        <w:t xml:space="preserve">169</w:t>
-      </w:r>
-    </w:p>
-    <w:p>
-      <w:pPr>
-        <w:numPr>
-          <w:ilvl w:val="0"/>
-          <w:numId w:val="1000"/>
-        </w:numPr>
-      </w:pPr>
-      <w:r>
-        <w:t xml:space="preserve">19</w:t>
-      </w:r>
-    </w:p>
-    <w:p>
-      <w:pPr>
-        <w:numPr>
-          <w:ilvl w:val="0"/>
-          <w:numId w:val="1000"/>
-        </w:numPr>
-      </w:pPr>
-      <w:r>
-        <w:t xml:space="preserve">161</w:t>
-      </w:r>
-    </w:p>
-    <w:p>
-      <w:pPr>
-        <w:numPr>
-          <w:ilvl w:val="0"/>
-          <w:numId w:val="1000"/>
-        </w:numPr>
-      </w:pPr>
-      <w:r>
-        <w:t xml:space="preserve">20</w:t>
-      </w:r>
-    </w:p>
-    <w:p>
-      <w:pPr>
-        <w:numPr>
-          <w:ilvl w:val="0"/>
-          <w:numId w:val="1000"/>
-        </w:numPr>
-      </w:pPr>
-      <w:r>
-        <w:t xml:space="preserve">163</w:t>
-      </w:r>
-    </w:p>
-    <w:p>
-      <w:pPr>
-        <w:numPr>
-          <w:ilvl w:val="0"/>
-          <w:numId w:val="1000"/>
-        </w:numPr>
-      </w:pPr>
-      <w:r>
-        <w:t xml:space="preserve">21</w:t>
-      </w:r>
-    </w:p>
-    <w:p>
-      <w:pPr>
-        <w:numPr>
-          <w:ilvl w:val="0"/>
-          <w:numId w:val="1000"/>
-        </w:numPr>
-      </w:pPr>
-      <w:r>
-        <w:t xml:space="preserve">157</w:t>
+        <w:t xml:space="preserve">146</w:t>
       </w:r>
     </w:p>
     <w:p>
@@ -4272,7 +4228,7 @@
         </w:numPr>
       </w:pPr>
       <w:r>
-        <w:t xml:space="preserve">Mínimo: 157 cm</w:t>
+        <w:t xml:space="preserve">Mínimo: 144 cm</w:t>
       </w:r>
     </w:p>
     <w:p>
@@ -4283,7 +4239,7 @@
         </w:numPr>
       </w:pPr>
       <w:r>
-        <w:t xml:space="preserve">Q1: 161 cm</w:t>
+        <w:t xml:space="preserve">Q1: 149 cm</w:t>
       </w:r>
     </w:p>
     <w:p>
@@ -4294,7 +4250,7 @@
         </w:numPr>
       </w:pPr>
       <w:r>
-        <w:t xml:space="preserve">Mediana: 169 cm</w:t>
+        <w:t xml:space="preserve">Mediana: 162 cm</w:t>
       </w:r>
     </w:p>
     <w:p>
@@ -4305,7 +4261,7 @@
         </w:numPr>
       </w:pPr>
       <w:r>
-        <w:t xml:space="preserve">Q3: 185 cm</w:t>
+        <w:t xml:space="preserve">Q3: 165 cm</w:t>
       </w:r>
     </w:p>
     <w:p>
@@ -4316,7 +4272,7 @@
         </w:numPr>
       </w:pPr>
       <w:r>
-        <w:t xml:space="preserve">Máximo: 191 cm</w:t>
+        <w:t xml:space="preserve">Máximo: 173 cm</w:t>
       </w:r>
     </w:p>
     <w:p>

</xml_diff>

<commit_message>
Escalando propuetas con 'cuartil-estatura-cloze.Rmd'
</commit_message>
<xml_diff>
--- a/06-Estadística-Y-Probabilidad/Pensamiento-Aleatorio/06-Medidas-De-Posición/salida/cuartil-estatura-02_1.docx
+++ b/06-Estadística-Y-Probabilidad/Pensamiento-Aleatorio/06-Medidas-De-Posición/salida/cuartil-estatura-02_1.docx
@@ -181,6 +181,116 @@
         </w:numPr>
       </w:pPr>
       <w:r>
+        <w:t xml:space="preserve">151</w:t>
+      </w:r>
+    </w:p>
+    <w:p>
+      <w:pPr>
+        <w:numPr>
+          <w:ilvl w:val="0"/>
+          <w:numId w:val="1000"/>
+        </w:numPr>
+      </w:pPr>
+      <w:r>
+        <w:t xml:space="preserve">2</w:t>
+      </w:r>
+    </w:p>
+    <w:p>
+      <w:pPr>
+        <w:numPr>
+          <w:ilvl w:val="0"/>
+          <w:numId w:val="1000"/>
+        </w:numPr>
+      </w:pPr>
+      <w:r>
+        <w:t xml:space="preserve">163</w:t>
+      </w:r>
+    </w:p>
+    <w:p>
+      <w:pPr>
+        <w:numPr>
+          <w:ilvl w:val="0"/>
+          <w:numId w:val="1000"/>
+        </w:numPr>
+      </w:pPr>
+      <w:r>
+        <w:t xml:space="preserve">3</w:t>
+      </w:r>
+    </w:p>
+    <w:p>
+      <w:pPr>
+        <w:numPr>
+          <w:ilvl w:val="0"/>
+          <w:numId w:val="1000"/>
+        </w:numPr>
+      </w:pPr>
+      <w:r>
+        <w:t xml:space="preserve">179</w:t>
+      </w:r>
+    </w:p>
+    <w:p>
+      <w:pPr>
+        <w:numPr>
+          <w:ilvl w:val="0"/>
+          <w:numId w:val="1000"/>
+        </w:numPr>
+      </w:pPr>
+      <w:r>
+        <w:t xml:space="preserve">4</w:t>
+      </w:r>
+    </w:p>
+    <w:p>
+      <w:pPr>
+        <w:numPr>
+          <w:ilvl w:val="0"/>
+          <w:numId w:val="1000"/>
+        </w:numPr>
+      </w:pPr>
+      <w:r>
+        <w:t xml:space="preserve">161</w:t>
+      </w:r>
+    </w:p>
+    <w:p>
+      <w:pPr>
+        <w:numPr>
+          <w:ilvl w:val="0"/>
+          <w:numId w:val="1000"/>
+        </w:numPr>
+      </w:pPr>
+      <w:r>
+        <w:t xml:space="preserve">5</w:t>
+      </w:r>
+    </w:p>
+    <w:p>
+      <w:pPr>
+        <w:numPr>
+          <w:ilvl w:val="0"/>
+          <w:numId w:val="1000"/>
+        </w:numPr>
+      </w:pPr>
+      <w:r>
+        <w:t xml:space="preserve">171</w:t>
+      </w:r>
+    </w:p>
+    <w:p>
+      <w:pPr>
+        <w:numPr>
+          <w:ilvl w:val="0"/>
+          <w:numId w:val="1000"/>
+        </w:numPr>
+      </w:pPr>
+      <w:r>
+        <w:t xml:space="preserve">6</w:t>
+      </w:r>
+    </w:p>
+    <w:p>
+      <w:pPr>
+        <w:numPr>
+          <w:ilvl w:val="0"/>
+          <w:numId w:val="1000"/>
+        </w:numPr>
+      </w:pPr>
+      <w:r>
         <w:t xml:space="preserve">180</w:t>
       </w:r>
     </w:p>
@@ -192,116 +302,6 @@
         </w:numPr>
       </w:pPr>
       <w:r>
-        <w:t xml:space="preserve">2</w:t>
-      </w:r>
-    </w:p>
-    <w:p>
-      <w:pPr>
-        <w:numPr>
-          <w:ilvl w:val="0"/>
-          <w:numId w:val="1000"/>
-        </w:numPr>
-      </w:pPr>
-      <w:r>
-        <w:t xml:space="preserve">166</w:t>
-      </w:r>
-    </w:p>
-    <w:p>
-      <w:pPr>
-        <w:numPr>
-          <w:ilvl w:val="0"/>
-          <w:numId w:val="1000"/>
-        </w:numPr>
-      </w:pPr>
-      <w:r>
-        <w:t xml:space="preserve">3</w:t>
-      </w:r>
-    </w:p>
-    <w:p>
-      <w:pPr>
-        <w:numPr>
-          <w:ilvl w:val="0"/>
-          <w:numId w:val="1000"/>
-        </w:numPr>
-      </w:pPr>
-      <w:r>
-        <w:t xml:space="preserve">166</w:t>
-      </w:r>
-    </w:p>
-    <w:p>
-      <w:pPr>
-        <w:numPr>
-          <w:ilvl w:val="0"/>
-          <w:numId w:val="1000"/>
-        </w:numPr>
-      </w:pPr>
-      <w:r>
-        <w:t xml:space="preserve">4</w:t>
-      </w:r>
-    </w:p>
-    <w:p>
-      <w:pPr>
-        <w:numPr>
-          <w:ilvl w:val="0"/>
-          <w:numId w:val="1000"/>
-        </w:numPr>
-      </w:pPr>
-      <w:r>
-        <w:t xml:space="preserve">160</w:t>
-      </w:r>
-    </w:p>
-    <w:p>
-      <w:pPr>
-        <w:numPr>
-          <w:ilvl w:val="0"/>
-          <w:numId w:val="1000"/>
-        </w:numPr>
-      </w:pPr>
-      <w:r>
-        <w:t xml:space="preserve">5</w:t>
-      </w:r>
-    </w:p>
-    <w:p>
-      <w:pPr>
-        <w:numPr>
-          <w:ilvl w:val="0"/>
-          <w:numId w:val="1000"/>
-        </w:numPr>
-      </w:pPr>
-      <w:r>
-        <w:t xml:space="preserve">167</w:t>
-      </w:r>
-    </w:p>
-    <w:p>
-      <w:pPr>
-        <w:numPr>
-          <w:ilvl w:val="0"/>
-          <w:numId w:val="1000"/>
-        </w:numPr>
-      </w:pPr>
-      <w:r>
-        <w:t xml:space="preserve">6</w:t>
-      </w:r>
-    </w:p>
-    <w:p>
-      <w:pPr>
-        <w:numPr>
-          <w:ilvl w:val="0"/>
-          <w:numId w:val="1000"/>
-        </w:numPr>
-      </w:pPr>
-      <w:r>
-        <w:t xml:space="preserve">173</w:t>
-      </w:r>
-    </w:p>
-    <w:p>
-      <w:pPr>
-        <w:numPr>
-          <w:ilvl w:val="0"/>
-          <w:numId w:val="1000"/>
-        </w:numPr>
-      </w:pPr>
-      <w:r>
         <w:t xml:space="preserve">7</w:t>
       </w:r>
     </w:p>
@@ -313,7 +313,7 @@
         </w:numPr>
       </w:pPr>
       <w:r>
-        <w:t xml:space="preserve">162</w:t>
+        <w:t xml:space="preserve">158</w:t>
       </w:r>
     </w:p>
     <w:p>
@@ -335,7 +335,7 @@
         </w:numPr>
       </w:pPr>
       <w:r>
-        <w:t xml:space="preserve">173</w:t>
+        <w:t xml:space="preserve">175</w:t>
       </w:r>
     </w:p>
     <w:p>
@@ -357,183 +357,7 @@
         </w:numPr>
       </w:pPr>
       <w:r>
-        <w:t xml:space="preserve">168</w:t>
-      </w:r>
-    </w:p>
-    <w:p>
-      <w:pPr>
-        <w:numPr>
-          <w:ilvl w:val="0"/>
-          <w:numId w:val="1000"/>
-        </w:numPr>
-      </w:pPr>
-      <w:r>
-        <w:t xml:space="preserve">10</w:t>
-      </w:r>
-    </w:p>
-    <w:p>
-      <w:pPr>
-        <w:numPr>
-          <w:ilvl w:val="0"/>
-          <w:numId w:val="1000"/>
-        </w:numPr>
-      </w:pPr>
-      <w:r>
-        <w:t xml:space="preserve">165</w:t>
-      </w:r>
-    </w:p>
-    <w:p>
-      <w:pPr>
-        <w:numPr>
-          <w:ilvl w:val="0"/>
-          <w:numId w:val="1000"/>
-        </w:numPr>
-      </w:pPr>
-      <w:r>
-        <w:t xml:space="preserve">11</w:t>
-      </w:r>
-    </w:p>
-    <w:p>
-      <w:pPr>
-        <w:numPr>
-          <w:ilvl w:val="0"/>
-          <w:numId w:val="1000"/>
-        </w:numPr>
-      </w:pPr>
-      <w:r>
-        <w:t xml:space="preserve">181</w:t>
-      </w:r>
-    </w:p>
-    <w:p>
-      <w:pPr>
-        <w:numPr>
-          <w:ilvl w:val="0"/>
-          <w:numId w:val="1000"/>
-        </w:numPr>
-      </w:pPr>
-      <w:r>
-        <w:t xml:space="preserve">12</w:t>
-      </w:r>
-    </w:p>
-    <w:p>
-      <w:pPr>
-        <w:numPr>
-          <w:ilvl w:val="0"/>
-          <w:numId w:val="1000"/>
-        </w:numPr>
-      </w:pPr>
-      <w:r>
-        <w:t xml:space="preserve">184</w:t>
-      </w:r>
-    </w:p>
-    <w:p>
-      <w:pPr>
-        <w:numPr>
-          <w:ilvl w:val="0"/>
-          <w:numId w:val="1000"/>
-        </w:numPr>
-      </w:pPr>
-      <w:r>
-        <w:t xml:space="preserve">13</w:t>
-      </w:r>
-    </w:p>
-    <w:p>
-      <w:pPr>
-        <w:numPr>
-          <w:ilvl w:val="0"/>
-          <w:numId w:val="1000"/>
-        </w:numPr>
-      </w:pPr>
-      <w:r>
-        <w:t xml:space="preserve">171</w:t>
-      </w:r>
-    </w:p>
-    <w:p>
-      <w:pPr>
-        <w:numPr>
-          <w:ilvl w:val="0"/>
-          <w:numId w:val="1000"/>
-        </w:numPr>
-      </w:pPr>
-      <w:r>
-        <w:t xml:space="preserve">14</w:t>
-      </w:r>
-    </w:p>
-    <w:p>
-      <w:pPr>
-        <w:numPr>
-          <w:ilvl w:val="0"/>
-          <w:numId w:val="1000"/>
-        </w:numPr>
-      </w:pPr>
-      <w:r>
-        <w:t xml:space="preserve">175</w:t>
-      </w:r>
-    </w:p>
-    <w:p>
-      <w:pPr>
-        <w:numPr>
-          <w:ilvl w:val="0"/>
-          <w:numId w:val="1000"/>
-        </w:numPr>
-      </w:pPr>
-      <w:r>
-        <w:t xml:space="preserve">15</w:t>
-      </w:r>
-    </w:p>
-    <w:p>
-      <w:pPr>
-        <w:numPr>
-          <w:ilvl w:val="0"/>
-          <w:numId w:val="1000"/>
-        </w:numPr>
-      </w:pPr>
-      <w:r>
-        <w:t xml:space="preserve">160</w:t>
-      </w:r>
-    </w:p>
-    <w:p>
-      <w:pPr>
-        <w:numPr>
-          <w:ilvl w:val="0"/>
-          <w:numId w:val="1000"/>
-        </w:numPr>
-      </w:pPr>
-      <w:r>
-        <w:t xml:space="preserve">16</w:t>
-      </w:r>
-    </w:p>
-    <w:p>
-      <w:pPr>
-        <w:numPr>
-          <w:ilvl w:val="0"/>
-          <w:numId w:val="1000"/>
-        </w:numPr>
-      </w:pPr>
-      <w:r>
-        <w:t xml:space="preserve">169</w:t>
-      </w:r>
-    </w:p>
-    <w:p>
-      <w:pPr>
-        <w:numPr>
-          <w:ilvl w:val="0"/>
-          <w:numId w:val="1000"/>
-        </w:numPr>
-      </w:pPr>
-      <w:r>
-        <w:t xml:space="preserve">17</w:t>
-      </w:r>
-    </w:p>
-    <w:p>
-      <w:pPr>
-        <w:numPr>
-          <w:ilvl w:val="0"/>
-          <w:numId w:val="1000"/>
-        </w:numPr>
-      </w:pPr>
-      <w:r>
-        <w:t xml:space="preserve">168</w:t>
+        <w:t xml:space="preserve">154</w:t>
       </w:r>
     </w:p>
     <w:p>
@@ -564,7 +388,7 @@
               <a:graphicData uri="http://schemas.openxmlformats.org/drawingml/2006/picture">
                 <pic:pic>
                   <pic:nvPicPr>
-                    <pic:cNvPr descr="media/supplements1/exercise1/DiagramaB-1.svg" id="22" name="Picture"/>
+                    <pic:cNvPr descr="media/supplements1/exercise1/DiagramaA-1.svg" id="22" name="Picture"/>
                     <pic:cNvPicPr>
                       <a:picLocks noChangeArrowheads="1" noChangeAspect="1"/>
                     </pic:cNvPicPr>
@@ -682,7 +506,7 @@
               <a:graphicData uri="http://schemas.openxmlformats.org/drawingml/2006/picture">
                 <pic:pic>
                   <pic:nvPicPr>
-                    <pic:cNvPr descr="media/supplements1/exercise1/DiagramaA-1.svg" id="30" name="Picture"/>
+                    <pic:cNvPr descr="media/supplements1/exercise1/DiagramaC-1.svg" id="30" name="Picture"/>
                     <pic:cNvPicPr>
                       <a:picLocks noChangeArrowheads="1" noChangeAspect="1"/>
                     </pic:cNvPicPr>
@@ -741,7 +565,7 @@
               <a:graphicData uri="http://schemas.openxmlformats.org/drawingml/2006/picture">
                 <pic:pic>
                   <pic:nvPicPr>
-                    <pic:cNvPr descr="media/supplements1/exercise1/DiagramaC-1.svg" id="34" name="Picture"/>
+                    <pic:cNvPr descr="media/supplements1/exercise1/DiagramaB-1.svg" id="34" name="Picture"/>
                     <pic:cNvPicPr>
                       <a:picLocks noChangeArrowheads="1" noChangeAspect="1"/>
                     </pic:cNvPicPr>
@@ -812,7 +636,7 @@
         </w:numPr>
       </w:pPr>
       <w:r>
-        <w:t xml:space="preserve">Mínimo: 160 cm</w:t>
+        <w:t xml:space="preserve">Mínimo: 151 cm</w:t>
       </w:r>
     </w:p>
     <w:p>
@@ -823,7 +647,7 @@
         </w:numPr>
       </w:pPr>
       <w:r>
-        <w:t xml:space="preserve">Q1: 166 cm</w:t>
+        <w:t xml:space="preserve">Q1: 158 cm</w:t>
       </w:r>
     </w:p>
     <w:p>
@@ -834,7 +658,7 @@
         </w:numPr>
       </w:pPr>
       <w:r>
-        <w:t xml:space="preserve">Mediana: 168 cm</w:t>
+        <w:t xml:space="preserve">Mediana: 163 cm</w:t>
       </w:r>
     </w:p>
     <w:p>
@@ -845,7 +669,7 @@
         </w:numPr>
       </w:pPr>
       <w:r>
-        <w:t xml:space="preserve">Q3: 173 cm</w:t>
+        <w:t xml:space="preserve">Q3: 175 cm</w:t>
       </w:r>
     </w:p>
     <w:p>
@@ -856,7 +680,7 @@
         </w:numPr>
       </w:pPr>
       <w:r>
-        <w:t xml:space="preserve">Máximo: 184 cm</w:t>
+        <w:t xml:space="preserve">Máximo: 180 cm</w:t>
       </w:r>
     </w:p>
     <w:p>
@@ -926,40 +750,40 @@
         </w:numPr>
       </w:pPr>
       <w:r>
+        <w:t xml:space="preserve">Correcto. Este diagrama representa fielmente todos los valores estadísticos.</w:t>
+      </w:r>
+    </w:p>
+    <w:p>
+      <w:pPr>
+        <w:numPr>
+          <w:ilvl w:val="1"/>
+          <w:numId w:val="1004"/>
+        </w:numPr>
+      </w:pPr>
+      <w:r>
+        <w:t xml:space="preserve">Incorrecto. La mediana está mal calculada.</w:t>
+      </w:r>
+    </w:p>
+    <w:p>
+      <w:pPr>
+        <w:numPr>
+          <w:ilvl w:val="1"/>
+          <w:numId w:val="1004"/>
+        </w:numPr>
+      </w:pPr>
+      <w:r>
+        <w:t xml:space="preserve">Incorrecto. Los cuartiles Q1 y Q3 están invertidos.</w:t>
+      </w:r>
+    </w:p>
+    <w:p>
+      <w:pPr>
+        <w:numPr>
+          <w:ilvl w:val="1"/>
+          <w:numId w:val="1004"/>
+        </w:numPr>
+      </w:pPr>
+      <w:r>
         <w:t xml:space="preserve">Incorrecto. Los valores están multiplicados por 10.</w:t>
-      </w:r>
-    </w:p>
-    <w:p>
-      <w:pPr>
-        <w:numPr>
-          <w:ilvl w:val="1"/>
-          <w:numId w:val="1004"/>
-        </w:numPr>
-      </w:pPr>
-      <w:r>
-        <w:t xml:space="preserve">Incorrecto. La mediana está mal calculada.</w:t>
-      </w:r>
-    </w:p>
-    <w:p>
-      <w:pPr>
-        <w:numPr>
-          <w:ilvl w:val="1"/>
-          <w:numId w:val="1004"/>
-        </w:numPr>
-      </w:pPr>
-      <w:r>
-        <w:t xml:space="preserve">Correcto. Este diagrama representa fielmente todos los valores estadísticos.</w:t>
-      </w:r>
-    </w:p>
-    <w:p>
-      <w:pPr>
-        <w:numPr>
-          <w:ilvl w:val="1"/>
-          <w:numId w:val="1004"/>
-        </w:numPr>
-      </w:pPr>
-      <w:r>
-        <w:t xml:space="preserve">Incorrecto. Los cuartiles Q1 y Q3 están invertidos.</w:t>
       </w:r>
     </w:p>
     <w:p>
@@ -1024,7 +848,7 @@
         </w:numPr>
       </w:pPr>
       <w:r>
-        <w:t xml:space="preserve">174</w:t>
+        <w:t xml:space="preserve">162</w:t>
       </w:r>
     </w:p>
     <w:p>
@@ -1068,7 +892,7 @@
         </w:numPr>
       </w:pPr>
       <w:r>
-        <w:t xml:space="preserve">172</w:t>
+        <w:t xml:space="preserve">165</w:t>
       </w:r>
     </w:p>
     <w:p>
@@ -1090,7 +914,7 @@
         </w:numPr>
       </w:pPr>
       <w:r>
-        <w:t xml:space="preserve">163</w:t>
+        <w:t xml:space="preserve">162</w:t>
       </w:r>
     </w:p>
     <w:p>
@@ -1112,7 +936,7 @@
         </w:numPr>
       </w:pPr>
       <w:r>
-        <w:t xml:space="preserve">144</w:t>
+        <w:t xml:space="preserve">166</w:t>
       </w:r>
     </w:p>
     <w:p>
@@ -1134,7 +958,7 @@
         </w:numPr>
       </w:pPr>
       <w:r>
-        <w:t xml:space="preserve">158</w:t>
+        <w:t xml:space="preserve">167</w:t>
       </w:r>
     </w:p>
     <w:p>
@@ -1156,7 +980,7 @@
         </w:numPr>
       </w:pPr>
       <w:r>
-        <w:t xml:space="preserve">155</w:t>
+        <w:t xml:space="preserve">169</w:t>
       </w:r>
     </w:p>
     <w:p>
@@ -1178,7 +1002,7 @@
         </w:numPr>
       </w:pPr>
       <w:r>
-        <w:t xml:space="preserve">165</w:t>
+        <w:t xml:space="preserve">162</w:t>
       </w:r>
     </w:p>
     <w:p>
@@ -1200,7 +1024,95 @@
         </w:numPr>
       </w:pPr>
       <w:r>
-        <w:t xml:space="preserve">173</w:t>
+        <w:t xml:space="preserve">157</w:t>
+      </w:r>
+    </w:p>
+    <w:p>
+      <w:pPr>
+        <w:numPr>
+          <w:ilvl w:val="0"/>
+          <w:numId w:val="1000"/>
+        </w:numPr>
+      </w:pPr>
+      <w:r>
+        <w:t xml:space="preserve">10</w:t>
+      </w:r>
+    </w:p>
+    <w:p>
+      <w:pPr>
+        <w:numPr>
+          <w:ilvl w:val="0"/>
+          <w:numId w:val="1000"/>
+        </w:numPr>
+      </w:pPr>
+      <w:r>
+        <w:t xml:space="preserve">168</w:t>
+      </w:r>
+    </w:p>
+    <w:p>
+      <w:pPr>
+        <w:numPr>
+          <w:ilvl w:val="0"/>
+          <w:numId w:val="1000"/>
+        </w:numPr>
+      </w:pPr>
+      <w:r>
+        <w:t xml:space="preserve">11</w:t>
+      </w:r>
+    </w:p>
+    <w:p>
+      <w:pPr>
+        <w:numPr>
+          <w:ilvl w:val="0"/>
+          <w:numId w:val="1000"/>
+        </w:numPr>
+      </w:pPr>
+      <w:r>
+        <w:t xml:space="preserve">160</w:t>
+      </w:r>
+    </w:p>
+    <w:p>
+      <w:pPr>
+        <w:numPr>
+          <w:ilvl w:val="0"/>
+          <w:numId w:val="1000"/>
+        </w:numPr>
+      </w:pPr>
+      <w:r>
+        <w:t xml:space="preserve">12</w:t>
+      </w:r>
+    </w:p>
+    <w:p>
+      <w:pPr>
+        <w:numPr>
+          <w:ilvl w:val="0"/>
+          <w:numId w:val="1000"/>
+        </w:numPr>
+      </w:pPr>
+      <w:r>
+        <w:t xml:space="preserve">160</w:t>
+      </w:r>
+    </w:p>
+    <w:p>
+      <w:pPr>
+        <w:numPr>
+          <w:ilvl w:val="0"/>
+          <w:numId w:val="1000"/>
+        </w:numPr>
+      </w:pPr>
+      <w:r>
+        <w:t xml:space="preserve">13</w:t>
+      </w:r>
+    </w:p>
+    <w:p>
+      <w:pPr>
+        <w:numPr>
+          <w:ilvl w:val="0"/>
+          <w:numId w:val="1000"/>
+        </w:numPr>
+      </w:pPr>
+      <w:r>
+        <w:t xml:space="preserve">169</w:t>
       </w:r>
     </w:p>
     <w:p>
@@ -1290,7 +1202,7 @@
               <a:graphicData uri="http://schemas.openxmlformats.org/drawingml/2006/picture">
                 <pic:pic>
                   <pic:nvPicPr>
-                    <pic:cNvPr descr="media/supplements1/exercise2/DiagramaB-1.svg" id="46" name="Picture"/>
+                    <pic:cNvPr descr="media/supplements1/exercise2/DiagramaA-1.svg" id="46" name="Picture"/>
                     <pic:cNvPicPr>
                       <a:picLocks noChangeArrowheads="1" noChangeAspect="1"/>
                     </pic:cNvPicPr>
@@ -1349,7 +1261,7 @@
               <a:graphicData uri="http://schemas.openxmlformats.org/drawingml/2006/picture">
                 <pic:pic>
                   <pic:nvPicPr>
-                    <pic:cNvPr descr="media/supplements1/exercise2/DiagramaA-1.svg" id="50" name="Picture"/>
+                    <pic:cNvPr descr="media/supplements1/exercise2/DiagramaB-1.svg" id="50" name="Picture"/>
                     <pic:cNvPicPr>
                       <a:picLocks noChangeArrowheads="1" noChangeAspect="1"/>
                     </pic:cNvPicPr>
@@ -1479,7 +1391,7 @@
         </w:numPr>
       </w:pPr>
       <w:r>
-        <w:t xml:space="preserve">Mínimo: 144 cm</w:t>
+        <w:t xml:space="preserve">Mínimo: 157 cm</w:t>
       </w:r>
     </w:p>
     <w:p>
@@ -1490,7 +1402,7 @@
         </w:numPr>
       </w:pPr>
       <w:r>
-        <w:t xml:space="preserve">Q1: 158 cm</w:t>
+        <w:t xml:space="preserve">Q1: 162 cm</w:t>
       </w:r>
     </w:p>
     <w:p>
@@ -1512,7 +1424,7 @@
         </w:numPr>
       </w:pPr>
       <w:r>
-        <w:t xml:space="preserve">Q3: 172 cm</w:t>
+        <w:t xml:space="preserve">Q3: 167 cm</w:t>
       </w:r>
     </w:p>
     <w:p>
@@ -1523,7 +1435,7 @@
         </w:numPr>
       </w:pPr>
       <w:r>
-        <w:t xml:space="preserve">Máximo: 174 cm</w:t>
+        <w:t xml:space="preserve">Máximo: 169 cm</w:t>
       </w:r>
     </w:p>
     <w:p>
@@ -1604,18 +1516,18 @@
         </w:numPr>
       </w:pPr>
       <w:r>
+        <w:t xml:space="preserve">Correcto. Este diagrama representa fielmente todos los valores estadísticos.</w:t>
+      </w:r>
+    </w:p>
+    <w:p>
+      <w:pPr>
+        <w:numPr>
+          <w:ilvl w:val="1"/>
+          <w:numId w:val="1007"/>
+        </w:numPr>
+      </w:pPr>
+      <w:r>
         <w:t xml:space="preserve">Incorrecto. Los valores están multiplicados por 10.</w:t>
-      </w:r>
-    </w:p>
-    <w:p>
-      <w:pPr>
-        <w:numPr>
-          <w:ilvl w:val="1"/>
-          <w:numId w:val="1007"/>
-        </w:numPr>
-      </w:pPr>
-      <w:r>
-        <w:t xml:space="preserve">Correcto. Este diagrama representa fielmente todos los valores estadísticos.</w:t>
       </w:r>
     </w:p>
     <w:p>
@@ -1691,7 +1603,7 @@
         </w:numPr>
       </w:pPr>
       <w:r>
-        <w:t xml:space="preserve">180</w:t>
+        <w:t xml:space="preserve">158</w:t>
       </w:r>
     </w:p>
     <w:p>
@@ -1713,7 +1625,7 @@
         </w:numPr>
       </w:pPr>
       <w:r>
-        <w:t xml:space="preserve">162</w:t>
+        <w:t xml:space="preserve">177</w:t>
       </w:r>
     </w:p>
     <w:p>
@@ -1735,7 +1647,7 @@
         </w:numPr>
       </w:pPr>
       <w:r>
-        <w:t xml:space="preserve">169</w:t>
+        <w:t xml:space="preserve">171</w:t>
       </w:r>
     </w:p>
     <w:p>
@@ -1757,7 +1669,7 @@
         </w:numPr>
       </w:pPr>
       <w:r>
-        <w:t xml:space="preserve">180</w:t>
+        <w:t xml:space="preserve">160</w:t>
       </w:r>
     </w:p>
     <w:p>
@@ -1779,7 +1691,7 @@
         </w:numPr>
       </w:pPr>
       <w:r>
-        <w:t xml:space="preserve">170</w:t>
+        <w:t xml:space="preserve">153</w:t>
       </w:r>
     </w:p>
     <w:p>
@@ -1801,7 +1713,7 @@
         </w:numPr>
       </w:pPr>
       <w:r>
-        <w:t xml:space="preserve">157</w:t>
+        <w:t xml:space="preserve">181</w:t>
       </w:r>
     </w:p>
     <w:p>
@@ -1823,7 +1735,7 @@
         </w:numPr>
       </w:pPr>
       <w:r>
-        <w:t xml:space="preserve">169</w:t>
+        <w:t xml:space="preserve">164</w:t>
       </w:r>
     </w:p>
     <w:p>
@@ -1845,7 +1757,7 @@
         </w:numPr>
       </w:pPr>
       <w:r>
-        <w:t xml:space="preserve">162</w:t>
+        <w:t xml:space="preserve">160</w:t>
       </w:r>
     </w:p>
     <w:p>
@@ -1867,7 +1779,7 @@
         </w:numPr>
       </w:pPr>
       <w:r>
-        <w:t xml:space="preserve">174</w:t>
+        <w:t xml:space="preserve">176</w:t>
       </w:r>
     </w:p>
     <w:p>
@@ -1889,7 +1801,7 @@
         </w:numPr>
       </w:pPr>
       <w:r>
-        <w:t xml:space="preserve">163</w:t>
+        <w:t xml:space="preserve">171</w:t>
       </w:r>
     </w:p>
     <w:p>
@@ -1911,7 +1823,7 @@
         </w:numPr>
       </w:pPr>
       <w:r>
-        <w:t xml:space="preserve">174</w:t>
+        <w:t xml:space="preserve">176</w:t>
       </w:r>
     </w:p>
     <w:p>
@@ -1933,7 +1845,7 @@
         </w:numPr>
       </w:pPr>
       <w:r>
-        <w:t xml:space="preserve">166</w:t>
+        <w:t xml:space="preserve">178</w:t>
       </w:r>
     </w:p>
     <w:p>
@@ -1955,7 +1867,7 @@
         </w:numPr>
       </w:pPr>
       <w:r>
-        <w:t xml:space="preserve">166</w:t>
+        <w:t xml:space="preserve">178</w:t>
       </w:r>
     </w:p>
     <w:p>
@@ -2045,7 +1957,7 @@
               <a:graphicData uri="http://schemas.openxmlformats.org/drawingml/2006/picture">
                 <pic:pic>
                   <pic:nvPicPr>
-                    <pic:cNvPr descr="media/supplements1/exercise3/DiagramaA-1.svg" id="66" name="Picture"/>
+                    <pic:cNvPr descr="media/supplements1/exercise3/DiagramaD-1.svg" id="66" name="Picture"/>
                     <pic:cNvPicPr>
                       <a:picLocks noChangeArrowheads="1" noChangeAspect="1"/>
                     </pic:cNvPicPr>
@@ -2163,7 +2075,7 @@
               <a:graphicData uri="http://schemas.openxmlformats.org/drawingml/2006/picture">
                 <pic:pic>
                   <pic:nvPicPr>
-                    <pic:cNvPr descr="media/supplements1/exercise3/DiagramaD-1.svg" id="74" name="Picture"/>
+                    <pic:cNvPr descr="media/supplements1/exercise3/DiagramaA-1.svg" id="74" name="Picture"/>
                     <pic:cNvPicPr>
                       <a:picLocks noChangeArrowheads="1" noChangeAspect="1"/>
                     </pic:cNvPicPr>
@@ -2234,7 +2146,7 @@
         </w:numPr>
       </w:pPr>
       <w:r>
-        <w:t xml:space="preserve">Mínimo: 157 cm</w:t>
+        <w:t xml:space="preserve">Mínimo: 153 cm</w:t>
       </w:r>
     </w:p>
     <w:p>
@@ -2245,7 +2157,7 @@
         </w:numPr>
       </w:pPr>
       <w:r>
-        <w:t xml:space="preserve">Q1: 163 cm</w:t>
+        <w:t xml:space="preserve">Q1: 160 cm</w:t>
       </w:r>
     </w:p>
     <w:p>
@@ -2256,7 +2168,7 @@
         </w:numPr>
       </w:pPr>
       <w:r>
-        <w:t xml:space="preserve">Mediana: 169 cm</w:t>
+        <w:t xml:space="preserve">Mediana: 171 cm</w:t>
       </w:r>
     </w:p>
     <w:p>
@@ -2267,7 +2179,7 @@
         </w:numPr>
       </w:pPr>
       <w:r>
-        <w:t xml:space="preserve">Q3: 174 cm</w:t>
+        <w:t xml:space="preserve">Q3: 177 cm</w:t>
       </w:r>
     </w:p>
     <w:p>
@@ -2278,7 +2190,7 @@
         </w:numPr>
       </w:pPr>
       <w:r>
-        <w:t xml:space="preserve">Máximo: 180 cm</w:t>
+        <w:t xml:space="preserve">Máximo: 181 cm</w:t>
       </w:r>
     </w:p>
     <w:p>
@@ -2359,29 +2271,29 @@
         </w:numPr>
       </w:pPr>
       <w:r>
+        <w:t xml:space="preserve">Incorrecto. La mediana está mal calculada.</w:t>
+      </w:r>
+    </w:p>
+    <w:p>
+      <w:pPr>
+        <w:numPr>
+          <w:ilvl w:val="1"/>
+          <w:numId w:val="1010"/>
+        </w:numPr>
+      </w:pPr>
+      <w:r>
+        <w:t xml:space="preserve">Incorrecto. Los cuartiles Q1 y Q3 están invertidos.</w:t>
+      </w:r>
+    </w:p>
+    <w:p>
+      <w:pPr>
+        <w:numPr>
+          <w:ilvl w:val="1"/>
+          <w:numId w:val="1010"/>
+        </w:numPr>
+      </w:pPr>
+      <w:r>
         <w:t xml:space="preserve">Correcto. Este diagrama representa fielmente todos los valores estadísticos.</w:t>
-      </w:r>
-    </w:p>
-    <w:p>
-      <w:pPr>
-        <w:numPr>
-          <w:ilvl w:val="1"/>
-          <w:numId w:val="1010"/>
-        </w:numPr>
-      </w:pPr>
-      <w:r>
-        <w:t xml:space="preserve">Incorrecto. Los cuartiles Q1 y Q3 están invertidos.</w:t>
-      </w:r>
-    </w:p>
-    <w:p>
-      <w:pPr>
-        <w:numPr>
-          <w:ilvl w:val="1"/>
-          <w:numId w:val="1010"/>
-        </w:numPr>
-      </w:pPr>
-      <w:r>
-        <w:t xml:space="preserve">Incorrecto. La mediana está mal calculada.</w:t>
       </w:r>
     </w:p>
     <w:p>
@@ -2446,6 +2358,160 @@
         </w:numPr>
       </w:pPr>
       <w:r>
+        <w:t xml:space="preserve">168</w:t>
+      </w:r>
+    </w:p>
+    <w:p>
+      <w:pPr>
+        <w:numPr>
+          <w:ilvl w:val="0"/>
+          <w:numId w:val="1000"/>
+        </w:numPr>
+      </w:pPr>
+      <w:r>
+        <w:t xml:space="preserve">2</w:t>
+      </w:r>
+    </w:p>
+    <w:p>
+      <w:pPr>
+        <w:numPr>
+          <w:ilvl w:val="0"/>
+          <w:numId w:val="1000"/>
+        </w:numPr>
+      </w:pPr>
+      <w:r>
+        <w:t xml:space="preserve">175</w:t>
+      </w:r>
+    </w:p>
+    <w:p>
+      <w:pPr>
+        <w:numPr>
+          <w:ilvl w:val="0"/>
+          <w:numId w:val="1000"/>
+        </w:numPr>
+      </w:pPr>
+      <w:r>
+        <w:t xml:space="preserve">3</w:t>
+      </w:r>
+    </w:p>
+    <w:p>
+      <w:pPr>
+        <w:numPr>
+          <w:ilvl w:val="0"/>
+          <w:numId w:val="1000"/>
+        </w:numPr>
+      </w:pPr>
+      <w:r>
+        <w:t xml:space="preserve">179</w:t>
+      </w:r>
+    </w:p>
+    <w:p>
+      <w:pPr>
+        <w:numPr>
+          <w:ilvl w:val="0"/>
+          <w:numId w:val="1000"/>
+        </w:numPr>
+      </w:pPr>
+      <w:r>
+        <w:t xml:space="preserve">4</w:t>
+      </w:r>
+    </w:p>
+    <w:p>
+      <w:pPr>
+        <w:numPr>
+          <w:ilvl w:val="0"/>
+          <w:numId w:val="1000"/>
+        </w:numPr>
+      </w:pPr>
+      <w:r>
+        <w:t xml:space="preserve">187</w:t>
+      </w:r>
+    </w:p>
+    <w:p>
+      <w:pPr>
+        <w:numPr>
+          <w:ilvl w:val="0"/>
+          <w:numId w:val="1000"/>
+        </w:numPr>
+      </w:pPr>
+      <w:r>
+        <w:t xml:space="preserve">5</w:t>
+      </w:r>
+    </w:p>
+    <w:p>
+      <w:pPr>
+        <w:numPr>
+          <w:ilvl w:val="0"/>
+          <w:numId w:val="1000"/>
+        </w:numPr>
+      </w:pPr>
+      <w:r>
+        <w:t xml:space="preserve">184</w:t>
+      </w:r>
+    </w:p>
+    <w:p>
+      <w:pPr>
+        <w:numPr>
+          <w:ilvl w:val="0"/>
+          <w:numId w:val="1000"/>
+        </w:numPr>
+      </w:pPr>
+      <w:r>
+        <w:t xml:space="preserve">6</w:t>
+      </w:r>
+    </w:p>
+    <w:p>
+      <w:pPr>
+        <w:numPr>
+          <w:ilvl w:val="0"/>
+          <w:numId w:val="1000"/>
+        </w:numPr>
+      </w:pPr>
+      <w:r>
+        <w:t xml:space="preserve">172</w:t>
+      </w:r>
+    </w:p>
+    <w:p>
+      <w:pPr>
+        <w:numPr>
+          <w:ilvl w:val="0"/>
+          <w:numId w:val="1000"/>
+        </w:numPr>
+      </w:pPr>
+      <w:r>
+        <w:t xml:space="preserve">7</w:t>
+      </w:r>
+    </w:p>
+    <w:p>
+      <w:pPr>
+        <w:numPr>
+          <w:ilvl w:val="0"/>
+          <w:numId w:val="1000"/>
+        </w:numPr>
+      </w:pPr>
+      <w:r>
+        <w:t xml:space="preserve">177</w:t>
+      </w:r>
+    </w:p>
+    <w:p>
+      <w:pPr>
+        <w:numPr>
+          <w:ilvl w:val="0"/>
+          <w:numId w:val="1000"/>
+        </w:numPr>
+      </w:pPr>
+      <w:r>
+        <w:t xml:space="preserve">8</w:t>
+      </w:r>
+    </w:p>
+    <w:p>
+      <w:pPr>
+        <w:numPr>
+          <w:ilvl w:val="0"/>
+          <w:numId w:val="1000"/>
+        </w:numPr>
+      </w:pPr>
+      <w:r>
         <w:t xml:space="preserve">170</w:t>
       </w:r>
     </w:p>
@@ -2457,160 +2523,6 @@
         </w:numPr>
       </w:pPr>
       <w:r>
-        <w:t xml:space="preserve">2</w:t>
-      </w:r>
-    </w:p>
-    <w:p>
-      <w:pPr>
-        <w:numPr>
-          <w:ilvl w:val="0"/>
-          <w:numId w:val="1000"/>
-        </w:numPr>
-      </w:pPr>
-      <w:r>
-        <w:t xml:space="preserve">170</w:t>
-      </w:r>
-    </w:p>
-    <w:p>
-      <w:pPr>
-        <w:numPr>
-          <w:ilvl w:val="0"/>
-          <w:numId w:val="1000"/>
-        </w:numPr>
-      </w:pPr>
-      <w:r>
-        <w:t xml:space="preserve">3</w:t>
-      </w:r>
-    </w:p>
-    <w:p>
-      <w:pPr>
-        <w:numPr>
-          <w:ilvl w:val="0"/>
-          <w:numId w:val="1000"/>
-        </w:numPr>
-      </w:pPr>
-      <w:r>
-        <w:t xml:space="preserve">174</w:t>
-      </w:r>
-    </w:p>
-    <w:p>
-      <w:pPr>
-        <w:numPr>
-          <w:ilvl w:val="0"/>
-          <w:numId w:val="1000"/>
-        </w:numPr>
-      </w:pPr>
-      <w:r>
-        <w:t xml:space="preserve">4</w:t>
-      </w:r>
-    </w:p>
-    <w:p>
-      <w:pPr>
-        <w:numPr>
-          <w:ilvl w:val="0"/>
-          <w:numId w:val="1000"/>
-        </w:numPr>
-      </w:pPr>
-      <w:r>
-        <w:t xml:space="preserve">163</w:t>
-      </w:r>
-    </w:p>
-    <w:p>
-      <w:pPr>
-        <w:numPr>
-          <w:ilvl w:val="0"/>
-          <w:numId w:val="1000"/>
-        </w:numPr>
-      </w:pPr>
-      <w:r>
-        <w:t xml:space="preserve">5</w:t>
-      </w:r>
-    </w:p>
-    <w:p>
-      <w:pPr>
-        <w:numPr>
-          <w:ilvl w:val="0"/>
-          <w:numId w:val="1000"/>
-        </w:numPr>
-      </w:pPr>
-      <w:r>
-        <w:t xml:space="preserve">162</w:t>
-      </w:r>
-    </w:p>
-    <w:p>
-      <w:pPr>
-        <w:numPr>
-          <w:ilvl w:val="0"/>
-          <w:numId w:val="1000"/>
-        </w:numPr>
-      </w:pPr>
-      <w:r>
-        <w:t xml:space="preserve">6</w:t>
-      </w:r>
-    </w:p>
-    <w:p>
-      <w:pPr>
-        <w:numPr>
-          <w:ilvl w:val="0"/>
-          <w:numId w:val="1000"/>
-        </w:numPr>
-      </w:pPr>
-      <w:r>
-        <w:t xml:space="preserve">163</w:t>
-      </w:r>
-    </w:p>
-    <w:p>
-      <w:pPr>
-        <w:numPr>
-          <w:ilvl w:val="0"/>
-          <w:numId w:val="1000"/>
-        </w:numPr>
-      </w:pPr>
-      <w:r>
-        <w:t xml:space="preserve">7</w:t>
-      </w:r>
-    </w:p>
-    <w:p>
-      <w:pPr>
-        <w:numPr>
-          <w:ilvl w:val="0"/>
-          <w:numId w:val="1000"/>
-        </w:numPr>
-      </w:pPr>
-      <w:r>
-        <w:t xml:space="preserve">168</w:t>
-      </w:r>
-    </w:p>
-    <w:p>
-      <w:pPr>
-        <w:numPr>
-          <w:ilvl w:val="0"/>
-          <w:numId w:val="1000"/>
-        </w:numPr>
-      </w:pPr>
-      <w:r>
-        <w:t xml:space="preserve">8</w:t>
-      </w:r>
-    </w:p>
-    <w:p>
-      <w:pPr>
-        <w:numPr>
-          <w:ilvl w:val="0"/>
-          <w:numId w:val="1000"/>
-        </w:numPr>
-      </w:pPr>
-      <w:r>
-        <w:t xml:space="preserve">166</w:t>
-      </w:r>
-    </w:p>
-    <w:p>
-      <w:pPr>
-        <w:numPr>
-          <w:ilvl w:val="0"/>
-          <w:numId w:val="1000"/>
-        </w:numPr>
-      </w:pPr>
-      <w:r>
         <w:t xml:space="preserve">9</w:t>
       </w:r>
     </w:p>
@@ -2622,7 +2534,139 @@
         </w:numPr>
       </w:pPr>
       <w:r>
-        <w:t xml:space="preserve">160</w:t>
+        <w:t xml:space="preserve">165</w:t>
+      </w:r>
+    </w:p>
+    <w:p>
+      <w:pPr>
+        <w:numPr>
+          <w:ilvl w:val="0"/>
+          <w:numId w:val="1000"/>
+        </w:numPr>
+      </w:pPr>
+      <w:r>
+        <w:t xml:space="preserve">10</w:t>
+      </w:r>
+    </w:p>
+    <w:p>
+      <w:pPr>
+        <w:numPr>
+          <w:ilvl w:val="0"/>
+          <w:numId w:val="1000"/>
+        </w:numPr>
+      </w:pPr>
+      <w:r>
+        <w:t xml:space="preserve">175</w:t>
+      </w:r>
+    </w:p>
+    <w:p>
+      <w:pPr>
+        <w:numPr>
+          <w:ilvl w:val="0"/>
+          <w:numId w:val="1000"/>
+        </w:numPr>
+      </w:pPr>
+      <w:r>
+        <w:t xml:space="preserve">11</w:t>
+      </w:r>
+    </w:p>
+    <w:p>
+      <w:pPr>
+        <w:numPr>
+          <w:ilvl w:val="0"/>
+          <w:numId w:val="1000"/>
+        </w:numPr>
+      </w:pPr>
+      <w:r>
+        <w:t xml:space="preserve">157</w:t>
+      </w:r>
+    </w:p>
+    <w:p>
+      <w:pPr>
+        <w:numPr>
+          <w:ilvl w:val="0"/>
+          <w:numId w:val="1000"/>
+        </w:numPr>
+      </w:pPr>
+      <w:r>
+        <w:t xml:space="preserve">12</w:t>
+      </w:r>
+    </w:p>
+    <w:p>
+      <w:pPr>
+        <w:numPr>
+          <w:ilvl w:val="0"/>
+          <w:numId w:val="1000"/>
+        </w:numPr>
+      </w:pPr>
+      <w:r>
+        <w:t xml:space="preserve">169</w:t>
+      </w:r>
+    </w:p>
+    <w:p>
+      <w:pPr>
+        <w:numPr>
+          <w:ilvl w:val="0"/>
+          <w:numId w:val="1000"/>
+        </w:numPr>
+      </w:pPr>
+      <w:r>
+        <w:t xml:space="preserve">13</w:t>
+      </w:r>
+    </w:p>
+    <w:p>
+      <w:pPr>
+        <w:numPr>
+          <w:ilvl w:val="0"/>
+          <w:numId w:val="1000"/>
+        </w:numPr>
+      </w:pPr>
+      <w:r>
+        <w:t xml:space="preserve">181</w:t>
+      </w:r>
+    </w:p>
+    <w:p>
+      <w:pPr>
+        <w:numPr>
+          <w:ilvl w:val="0"/>
+          <w:numId w:val="1000"/>
+        </w:numPr>
+      </w:pPr>
+      <w:r>
+        <w:t xml:space="preserve">14</w:t>
+      </w:r>
+    </w:p>
+    <w:p>
+      <w:pPr>
+        <w:numPr>
+          <w:ilvl w:val="0"/>
+          <w:numId w:val="1000"/>
+        </w:numPr>
+      </w:pPr>
+      <w:r>
+        <w:t xml:space="preserve">189</w:t>
+      </w:r>
+    </w:p>
+    <w:p>
+      <w:pPr>
+        <w:numPr>
+          <w:ilvl w:val="0"/>
+          <w:numId w:val="1000"/>
+        </w:numPr>
+      </w:pPr>
+      <w:r>
+        <w:t xml:space="preserve">15</w:t>
+      </w:r>
+    </w:p>
+    <w:p>
+      <w:pPr>
+        <w:numPr>
+          <w:ilvl w:val="0"/>
+          <w:numId w:val="1000"/>
+        </w:numPr>
+      </w:pPr>
+      <w:r>
+        <w:t xml:space="preserve">186</w:t>
       </w:r>
     </w:p>
     <w:p>
@@ -2653,7 +2697,7 @@
               <a:graphicData uri="http://schemas.openxmlformats.org/drawingml/2006/picture">
                 <pic:pic>
                   <pic:nvPicPr>
-                    <pic:cNvPr descr="media/supplements1/exercise4/DiagramaA-1.svg" id="82" name="Picture"/>
+                    <pic:cNvPr descr="media/supplements1/exercise4/DiagramaB-1.svg" id="82" name="Picture"/>
                     <pic:cNvPicPr>
                       <a:picLocks noChangeArrowheads="1" noChangeAspect="1"/>
                     </pic:cNvPicPr>
@@ -2712,7 +2756,7 @@
               <a:graphicData uri="http://schemas.openxmlformats.org/drawingml/2006/picture">
                 <pic:pic>
                   <pic:nvPicPr>
-                    <pic:cNvPr descr="media/supplements1/exercise4/DiagramaC-1.svg" id="86" name="Picture"/>
+                    <pic:cNvPr descr="media/supplements1/exercise4/DiagramaD-1.svg" id="86" name="Picture"/>
                     <pic:cNvPicPr>
                       <a:picLocks noChangeArrowheads="1" noChangeAspect="1"/>
                     </pic:cNvPicPr>
@@ -2771,7 +2815,7 @@
               <a:graphicData uri="http://schemas.openxmlformats.org/drawingml/2006/picture">
                 <pic:pic>
                   <pic:nvPicPr>
-                    <pic:cNvPr descr="media/supplements1/exercise4/DiagramaD-1.svg" id="90" name="Picture"/>
+                    <pic:cNvPr descr="media/supplements1/exercise4/DiagramaA-1.svg" id="90" name="Picture"/>
                     <pic:cNvPicPr>
                       <a:picLocks noChangeArrowheads="1" noChangeAspect="1"/>
                     </pic:cNvPicPr>
@@ -2830,7 +2874,7 @@
               <a:graphicData uri="http://schemas.openxmlformats.org/drawingml/2006/picture">
                 <pic:pic>
                   <pic:nvPicPr>
-                    <pic:cNvPr descr="media/supplements1/exercise4/DiagramaB-1.svg" id="94" name="Picture"/>
+                    <pic:cNvPr descr="media/supplements1/exercise4/DiagramaC-1.svg" id="94" name="Picture"/>
                     <pic:cNvPicPr>
                       <a:picLocks noChangeArrowheads="1" noChangeAspect="1"/>
                     </pic:cNvPicPr>
@@ -2901,7 +2945,7 @@
         </w:numPr>
       </w:pPr>
       <w:r>
-        <w:t xml:space="preserve">Mínimo: 160 cm</w:t>
+        <w:t xml:space="preserve">Mínimo: 157 cm</w:t>
       </w:r>
     </w:p>
     <w:p>
@@ -2912,7 +2956,7 @@
         </w:numPr>
       </w:pPr>
       <w:r>
-        <w:t xml:space="preserve">Q1: 163 cm</w:t>
+        <w:t xml:space="preserve">Q1: 169 cm</w:t>
       </w:r>
     </w:p>
     <w:p>
@@ -2923,7 +2967,7 @@
         </w:numPr>
       </w:pPr>
       <w:r>
-        <w:t xml:space="preserve">Mediana: 166 cm</w:t>
+        <w:t xml:space="preserve">Mediana: 175 cm</w:t>
       </w:r>
     </w:p>
     <w:p>
@@ -2934,7 +2978,7 @@
         </w:numPr>
       </w:pPr>
       <w:r>
-        <w:t xml:space="preserve">Q3: 170 cm</w:t>
+        <w:t xml:space="preserve">Q3: 184 cm</w:t>
       </w:r>
     </w:p>
     <w:p>
@@ -2945,7 +2989,7 @@
         </w:numPr>
       </w:pPr>
       <w:r>
-        <w:t xml:space="preserve">Máximo: 174 cm</w:t>
+        <w:t xml:space="preserve">Máximo: 189 cm</w:t>
       </w:r>
     </w:p>
     <w:p>
@@ -3015,6 +3059,28 @@
         </w:numPr>
       </w:pPr>
       <w:r>
+        <w:t xml:space="preserve">Incorrecto. Los valores están multiplicados por 10.</w:t>
+      </w:r>
+    </w:p>
+    <w:p>
+      <w:pPr>
+        <w:numPr>
+          <w:ilvl w:val="1"/>
+          <w:numId w:val="1013"/>
+        </w:numPr>
+      </w:pPr>
+      <w:r>
+        <w:t xml:space="preserve">Incorrecto. La mediana está mal calculada.</w:t>
+      </w:r>
+    </w:p>
+    <w:p>
+      <w:pPr>
+        <w:numPr>
+          <w:ilvl w:val="1"/>
+          <w:numId w:val="1013"/>
+        </w:numPr>
+      </w:pPr>
+      <w:r>
         <w:t xml:space="preserve">Correcto. Este diagrama representa fielmente todos los valores estadísticos.</w:t>
       </w:r>
     </w:p>
@@ -3027,28 +3093,6 @@
       </w:pPr>
       <w:r>
         <w:t xml:space="preserve">Incorrecto. Los cuartiles Q1 y Q3 están invertidos.</w:t>
-      </w:r>
-    </w:p>
-    <w:p>
-      <w:pPr>
-        <w:numPr>
-          <w:ilvl w:val="1"/>
-          <w:numId w:val="1013"/>
-        </w:numPr>
-      </w:pPr>
-      <w:r>
-        <w:t xml:space="preserve">Incorrecto. La mediana está mal calculada.</w:t>
-      </w:r>
-    </w:p>
-    <w:p>
-      <w:pPr>
-        <w:numPr>
-          <w:ilvl w:val="1"/>
-          <w:numId w:val="1013"/>
-        </w:numPr>
-      </w:pPr>
-      <w:r>
-        <w:t xml:space="preserve">Incorrecto. Los valores están multiplicados por 10.</w:t>
       </w:r>
     </w:p>
     <w:p>
@@ -3113,7 +3157,7 @@
         </w:numPr>
       </w:pPr>
       <w:r>
-        <w:t xml:space="preserve">164</w:t>
+        <w:t xml:space="preserve">179</w:t>
       </w:r>
     </w:p>
     <w:p>
@@ -3135,6 +3179,380 @@
         </w:numPr>
       </w:pPr>
       <w:r>
+        <w:t xml:space="preserve">172</w:t>
+      </w:r>
+    </w:p>
+    <w:p>
+      <w:pPr>
+        <w:numPr>
+          <w:ilvl w:val="0"/>
+          <w:numId w:val="1000"/>
+        </w:numPr>
+      </w:pPr>
+      <w:r>
+        <w:t xml:space="preserve">3</w:t>
+      </w:r>
+    </w:p>
+    <w:p>
+      <w:pPr>
+        <w:numPr>
+          <w:ilvl w:val="0"/>
+          <w:numId w:val="1000"/>
+        </w:numPr>
+      </w:pPr>
+      <w:r>
+        <w:t xml:space="preserve">155</w:t>
+      </w:r>
+    </w:p>
+    <w:p>
+      <w:pPr>
+        <w:numPr>
+          <w:ilvl w:val="0"/>
+          <w:numId w:val="1000"/>
+        </w:numPr>
+      </w:pPr>
+      <w:r>
+        <w:t xml:space="preserve">4</w:t>
+      </w:r>
+    </w:p>
+    <w:p>
+      <w:pPr>
+        <w:numPr>
+          <w:ilvl w:val="0"/>
+          <w:numId w:val="1000"/>
+        </w:numPr>
+      </w:pPr>
+      <w:r>
+        <w:t xml:space="preserve">188</w:t>
+      </w:r>
+    </w:p>
+    <w:p>
+      <w:pPr>
+        <w:numPr>
+          <w:ilvl w:val="0"/>
+          <w:numId w:val="1000"/>
+        </w:numPr>
+      </w:pPr>
+      <w:r>
+        <w:t xml:space="preserve">5</w:t>
+      </w:r>
+    </w:p>
+    <w:p>
+      <w:pPr>
+        <w:numPr>
+          <w:ilvl w:val="0"/>
+          <w:numId w:val="1000"/>
+        </w:numPr>
+      </w:pPr>
+      <w:r>
+        <w:t xml:space="preserve">161</w:t>
+      </w:r>
+    </w:p>
+    <w:p>
+      <w:pPr>
+        <w:numPr>
+          <w:ilvl w:val="0"/>
+          <w:numId w:val="1000"/>
+        </w:numPr>
+      </w:pPr>
+      <w:r>
+        <w:t xml:space="preserve">6</w:t>
+      </w:r>
+    </w:p>
+    <w:p>
+      <w:pPr>
+        <w:numPr>
+          <w:ilvl w:val="0"/>
+          <w:numId w:val="1000"/>
+        </w:numPr>
+      </w:pPr>
+      <w:r>
+        <w:t xml:space="preserve">140</w:t>
+      </w:r>
+    </w:p>
+    <w:p>
+      <w:pPr>
+        <w:numPr>
+          <w:ilvl w:val="0"/>
+          <w:numId w:val="1000"/>
+        </w:numPr>
+      </w:pPr>
+      <w:r>
+        <w:t xml:space="preserve">7</w:t>
+      </w:r>
+    </w:p>
+    <w:p>
+      <w:pPr>
+        <w:numPr>
+          <w:ilvl w:val="0"/>
+          <w:numId w:val="1000"/>
+        </w:numPr>
+      </w:pPr>
+      <w:r>
+        <w:t xml:space="preserve">185</w:t>
+      </w:r>
+    </w:p>
+    <w:p>
+      <w:pPr>
+        <w:numPr>
+          <w:ilvl w:val="0"/>
+          <w:numId w:val="1000"/>
+        </w:numPr>
+      </w:pPr>
+      <w:r>
+        <w:t xml:space="preserve">8</w:t>
+      </w:r>
+    </w:p>
+    <w:p>
+      <w:pPr>
+        <w:numPr>
+          <w:ilvl w:val="0"/>
+          <w:numId w:val="1000"/>
+        </w:numPr>
+      </w:pPr>
+      <w:r>
+        <w:t xml:space="preserve">158</w:t>
+      </w:r>
+    </w:p>
+    <w:p>
+      <w:pPr>
+        <w:numPr>
+          <w:ilvl w:val="0"/>
+          <w:numId w:val="1000"/>
+        </w:numPr>
+      </w:pPr>
+      <w:r>
+        <w:t xml:space="preserve">9</w:t>
+      </w:r>
+    </w:p>
+    <w:p>
+      <w:pPr>
+        <w:numPr>
+          <w:ilvl w:val="0"/>
+          <w:numId w:val="1000"/>
+        </w:numPr>
+      </w:pPr>
+      <w:r>
+        <w:t xml:space="preserve">146</w:t>
+      </w:r>
+    </w:p>
+    <w:p>
+      <w:pPr>
+        <w:numPr>
+          <w:ilvl w:val="0"/>
+          <w:numId w:val="1000"/>
+        </w:numPr>
+      </w:pPr>
+      <w:r>
+        <w:t xml:space="preserve">10</w:t>
+      </w:r>
+    </w:p>
+    <w:p>
+      <w:pPr>
+        <w:numPr>
+          <w:ilvl w:val="0"/>
+          <w:numId w:val="1000"/>
+        </w:numPr>
+      </w:pPr>
+      <w:r>
+        <w:t xml:space="preserve">184</w:t>
+      </w:r>
+    </w:p>
+    <w:p>
+      <w:pPr>
+        <w:numPr>
+          <w:ilvl w:val="0"/>
+          <w:numId w:val="1000"/>
+        </w:numPr>
+      </w:pPr>
+      <w:r>
+        <w:t xml:space="preserve">11</w:t>
+      </w:r>
+    </w:p>
+    <w:p>
+      <w:pPr>
+        <w:numPr>
+          <w:ilvl w:val="0"/>
+          <w:numId w:val="1000"/>
+        </w:numPr>
+      </w:pPr>
+      <w:r>
+        <w:t xml:space="preserve">180</w:t>
+      </w:r>
+    </w:p>
+    <w:p>
+      <w:pPr>
+        <w:numPr>
+          <w:ilvl w:val="0"/>
+          <w:numId w:val="1000"/>
+        </w:numPr>
+      </w:pPr>
+      <w:r>
+        <w:t xml:space="preserve">12</w:t>
+      </w:r>
+    </w:p>
+    <w:p>
+      <w:pPr>
+        <w:numPr>
+          <w:ilvl w:val="0"/>
+          <w:numId w:val="1000"/>
+        </w:numPr>
+      </w:pPr>
+      <w:r>
+        <w:t xml:space="preserve">154</w:t>
+      </w:r>
+    </w:p>
+    <w:p>
+      <w:pPr>
+        <w:numPr>
+          <w:ilvl w:val="0"/>
+          <w:numId w:val="1000"/>
+        </w:numPr>
+      </w:pPr>
+      <w:r>
+        <w:t xml:space="preserve">13</w:t>
+      </w:r>
+    </w:p>
+    <w:p>
+      <w:pPr>
+        <w:numPr>
+          <w:ilvl w:val="0"/>
+          <w:numId w:val="1000"/>
+        </w:numPr>
+      </w:pPr>
+      <w:r>
+        <w:t xml:space="preserve">180</w:t>
+      </w:r>
+    </w:p>
+    <w:p>
+      <w:pPr>
+        <w:numPr>
+          <w:ilvl w:val="0"/>
+          <w:numId w:val="1000"/>
+        </w:numPr>
+      </w:pPr>
+      <w:r>
+        <w:t xml:space="preserve">14</w:t>
+      </w:r>
+    </w:p>
+    <w:p>
+      <w:pPr>
+        <w:numPr>
+          <w:ilvl w:val="0"/>
+          <w:numId w:val="1000"/>
+        </w:numPr>
+      </w:pPr>
+      <w:r>
+        <w:t xml:space="preserve">174</w:t>
+      </w:r>
+    </w:p>
+    <w:p>
+      <w:pPr>
+        <w:numPr>
+          <w:ilvl w:val="0"/>
+          <w:numId w:val="1000"/>
+        </w:numPr>
+      </w:pPr>
+      <w:r>
+        <w:t xml:space="preserve">15</w:t>
+      </w:r>
+    </w:p>
+    <w:p>
+      <w:pPr>
+        <w:numPr>
+          <w:ilvl w:val="0"/>
+          <w:numId w:val="1000"/>
+        </w:numPr>
+      </w:pPr>
+      <w:r>
+        <w:t xml:space="preserve">167</w:t>
+      </w:r>
+    </w:p>
+    <w:p>
+      <w:pPr>
+        <w:numPr>
+          <w:ilvl w:val="0"/>
+          <w:numId w:val="1000"/>
+        </w:numPr>
+      </w:pPr>
+      <w:r>
+        <w:t xml:space="preserve">16</w:t>
+      </w:r>
+    </w:p>
+    <w:p>
+      <w:pPr>
+        <w:numPr>
+          <w:ilvl w:val="0"/>
+          <w:numId w:val="1000"/>
+        </w:numPr>
+      </w:pPr>
+      <w:r>
+        <w:t xml:space="preserve">180</w:t>
+      </w:r>
+    </w:p>
+    <w:p>
+      <w:pPr>
+        <w:numPr>
+          <w:ilvl w:val="0"/>
+          <w:numId w:val="1000"/>
+        </w:numPr>
+      </w:pPr>
+      <w:r>
+        <w:t xml:space="preserve">17</w:t>
+      </w:r>
+    </w:p>
+    <w:p>
+      <w:pPr>
+        <w:numPr>
+          <w:ilvl w:val="0"/>
+          <w:numId w:val="1000"/>
+        </w:numPr>
+      </w:pPr>
+      <w:r>
+        <w:t xml:space="preserve">162</w:t>
+      </w:r>
+    </w:p>
+    <w:p>
+      <w:pPr>
+        <w:numPr>
+          <w:ilvl w:val="0"/>
+          <w:numId w:val="1000"/>
+        </w:numPr>
+      </w:pPr>
+      <w:r>
+        <w:t xml:space="preserve">18</w:t>
+      </w:r>
+    </w:p>
+    <w:p>
+      <w:pPr>
+        <w:numPr>
+          <w:ilvl w:val="0"/>
+          <w:numId w:val="1000"/>
+        </w:numPr>
+      </w:pPr>
+      <w:r>
+        <w:t xml:space="preserve">171</w:t>
+      </w:r>
+    </w:p>
+    <w:p>
+      <w:pPr>
+        <w:numPr>
+          <w:ilvl w:val="0"/>
+          <w:numId w:val="1000"/>
+        </w:numPr>
+      </w:pPr>
+      <w:r>
+        <w:t xml:space="preserve">19</w:t>
+      </w:r>
+    </w:p>
+    <w:p>
+      <w:pPr>
+        <w:numPr>
+          <w:ilvl w:val="0"/>
+          <w:numId w:val="1000"/>
+        </w:numPr>
+      </w:pPr>
+      <w:r>
         <w:t xml:space="preserve">159</w:t>
       </w:r>
     </w:p>
@@ -3146,380 +3564,6 @@
         </w:numPr>
       </w:pPr>
       <w:r>
-        <w:t xml:space="preserve">3</w:t>
-      </w:r>
-    </w:p>
-    <w:p>
-      <w:pPr>
-        <w:numPr>
-          <w:ilvl w:val="0"/>
-          <w:numId w:val="1000"/>
-        </w:numPr>
-      </w:pPr>
-      <w:r>
-        <w:t xml:space="preserve">149</w:t>
-      </w:r>
-    </w:p>
-    <w:p>
-      <w:pPr>
-        <w:numPr>
-          <w:ilvl w:val="0"/>
-          <w:numId w:val="1000"/>
-        </w:numPr>
-      </w:pPr>
-      <w:r>
-        <w:t xml:space="preserve">4</w:t>
-      </w:r>
-    </w:p>
-    <w:p>
-      <w:pPr>
-        <w:numPr>
-          <w:ilvl w:val="0"/>
-          <w:numId w:val="1000"/>
-        </w:numPr>
-      </w:pPr>
-      <w:r>
-        <w:t xml:space="preserve">159</w:t>
-      </w:r>
-    </w:p>
-    <w:p>
-      <w:pPr>
-        <w:numPr>
-          <w:ilvl w:val="0"/>
-          <w:numId w:val="1000"/>
-        </w:numPr>
-      </w:pPr>
-      <w:r>
-        <w:t xml:space="preserve">5</w:t>
-      </w:r>
-    </w:p>
-    <w:p>
-      <w:pPr>
-        <w:numPr>
-          <w:ilvl w:val="0"/>
-          <w:numId w:val="1000"/>
-        </w:numPr>
-      </w:pPr>
-      <w:r>
-        <w:t xml:space="preserve">167</w:t>
-      </w:r>
-    </w:p>
-    <w:p>
-      <w:pPr>
-        <w:numPr>
-          <w:ilvl w:val="0"/>
-          <w:numId w:val="1000"/>
-        </w:numPr>
-      </w:pPr>
-      <w:r>
-        <w:t xml:space="preserve">6</w:t>
-      </w:r>
-    </w:p>
-    <w:p>
-      <w:pPr>
-        <w:numPr>
-          <w:ilvl w:val="0"/>
-          <w:numId w:val="1000"/>
-        </w:numPr>
-      </w:pPr>
-      <w:r>
-        <w:t xml:space="preserve">156</w:t>
-      </w:r>
-    </w:p>
-    <w:p>
-      <w:pPr>
-        <w:numPr>
-          <w:ilvl w:val="0"/>
-          <w:numId w:val="1000"/>
-        </w:numPr>
-      </w:pPr>
-      <w:r>
-        <w:t xml:space="preserve">7</w:t>
-      </w:r>
-    </w:p>
-    <w:p>
-      <w:pPr>
-        <w:numPr>
-          <w:ilvl w:val="0"/>
-          <w:numId w:val="1000"/>
-        </w:numPr>
-      </w:pPr>
-      <w:r>
-        <w:t xml:space="preserve">160</w:t>
-      </w:r>
-    </w:p>
-    <w:p>
-      <w:pPr>
-        <w:numPr>
-          <w:ilvl w:val="0"/>
-          <w:numId w:val="1000"/>
-        </w:numPr>
-      </w:pPr>
-      <w:r>
-        <w:t xml:space="preserve">8</w:t>
-      </w:r>
-    </w:p>
-    <w:p>
-      <w:pPr>
-        <w:numPr>
-          <w:ilvl w:val="0"/>
-          <w:numId w:val="1000"/>
-        </w:numPr>
-      </w:pPr>
-      <w:r>
-        <w:t xml:space="preserve">170</w:t>
-      </w:r>
-    </w:p>
-    <w:p>
-      <w:pPr>
-        <w:numPr>
-          <w:ilvl w:val="0"/>
-          <w:numId w:val="1000"/>
-        </w:numPr>
-      </w:pPr>
-      <w:r>
-        <w:t xml:space="preserve">9</w:t>
-      </w:r>
-    </w:p>
-    <w:p>
-      <w:pPr>
-        <w:numPr>
-          <w:ilvl w:val="0"/>
-          <w:numId w:val="1000"/>
-        </w:numPr>
-      </w:pPr>
-      <w:r>
-        <w:t xml:space="preserve">173</w:t>
-      </w:r>
-    </w:p>
-    <w:p>
-      <w:pPr>
-        <w:numPr>
-          <w:ilvl w:val="0"/>
-          <w:numId w:val="1000"/>
-        </w:numPr>
-      </w:pPr>
-      <w:r>
-        <w:t xml:space="preserve">10</w:t>
-      </w:r>
-    </w:p>
-    <w:p>
-      <w:pPr>
-        <w:numPr>
-          <w:ilvl w:val="0"/>
-          <w:numId w:val="1000"/>
-        </w:numPr>
-      </w:pPr>
-      <w:r>
-        <w:t xml:space="preserve">169</w:t>
-      </w:r>
-    </w:p>
-    <w:p>
-      <w:pPr>
-        <w:numPr>
-          <w:ilvl w:val="0"/>
-          <w:numId w:val="1000"/>
-        </w:numPr>
-      </w:pPr>
-      <w:r>
-        <w:t xml:space="preserve">11</w:t>
-      </w:r>
-    </w:p>
-    <w:p>
-      <w:pPr>
-        <w:numPr>
-          <w:ilvl w:val="0"/>
-          <w:numId w:val="1000"/>
-        </w:numPr>
-      </w:pPr>
-      <w:r>
-        <w:t xml:space="preserve">167</w:t>
-      </w:r>
-    </w:p>
-    <w:p>
-      <w:pPr>
-        <w:numPr>
-          <w:ilvl w:val="0"/>
-          <w:numId w:val="1000"/>
-        </w:numPr>
-      </w:pPr>
-      <w:r>
-        <w:t xml:space="preserve">12</w:t>
-      </w:r>
-    </w:p>
-    <w:p>
-      <w:pPr>
-        <w:numPr>
-          <w:ilvl w:val="0"/>
-          <w:numId w:val="1000"/>
-        </w:numPr>
-      </w:pPr>
-      <w:r>
-        <w:t xml:space="preserve">153</w:t>
-      </w:r>
-    </w:p>
-    <w:p>
-      <w:pPr>
-        <w:numPr>
-          <w:ilvl w:val="0"/>
-          <w:numId w:val="1000"/>
-        </w:numPr>
-      </w:pPr>
-      <w:r>
-        <w:t xml:space="preserve">13</w:t>
-      </w:r>
-    </w:p>
-    <w:p>
-      <w:pPr>
-        <w:numPr>
-          <w:ilvl w:val="0"/>
-          <w:numId w:val="1000"/>
-        </w:numPr>
-      </w:pPr>
-      <w:r>
-        <w:t xml:space="preserve">173</w:t>
-      </w:r>
-    </w:p>
-    <w:p>
-      <w:pPr>
-        <w:numPr>
-          <w:ilvl w:val="0"/>
-          <w:numId w:val="1000"/>
-        </w:numPr>
-      </w:pPr>
-      <w:r>
-        <w:t xml:space="preserve">14</w:t>
-      </w:r>
-    </w:p>
-    <w:p>
-      <w:pPr>
-        <w:numPr>
-          <w:ilvl w:val="0"/>
-          <w:numId w:val="1000"/>
-        </w:numPr>
-      </w:pPr>
-      <w:r>
-        <w:t xml:space="preserve">156</w:t>
-      </w:r>
-    </w:p>
-    <w:p>
-      <w:pPr>
-        <w:numPr>
-          <w:ilvl w:val="0"/>
-          <w:numId w:val="1000"/>
-        </w:numPr>
-      </w:pPr>
-      <w:r>
-        <w:t xml:space="preserve">15</w:t>
-      </w:r>
-    </w:p>
-    <w:p>
-      <w:pPr>
-        <w:numPr>
-          <w:ilvl w:val="0"/>
-          <w:numId w:val="1000"/>
-        </w:numPr>
-      </w:pPr>
-      <w:r>
-        <w:t xml:space="preserve">152</w:t>
-      </w:r>
-    </w:p>
-    <w:p>
-      <w:pPr>
-        <w:numPr>
-          <w:ilvl w:val="0"/>
-          <w:numId w:val="1000"/>
-        </w:numPr>
-      </w:pPr>
-      <w:r>
-        <w:t xml:space="preserve">16</w:t>
-      </w:r>
-    </w:p>
-    <w:p>
-      <w:pPr>
-        <w:numPr>
-          <w:ilvl w:val="0"/>
-          <w:numId w:val="1000"/>
-        </w:numPr>
-      </w:pPr>
-      <w:r>
-        <w:t xml:space="preserve">168</w:t>
-      </w:r>
-    </w:p>
-    <w:p>
-      <w:pPr>
-        <w:numPr>
-          <w:ilvl w:val="0"/>
-          <w:numId w:val="1000"/>
-        </w:numPr>
-      </w:pPr>
-      <w:r>
-        <w:t xml:space="preserve">17</w:t>
-      </w:r>
-    </w:p>
-    <w:p>
-      <w:pPr>
-        <w:numPr>
-          <w:ilvl w:val="0"/>
-          <w:numId w:val="1000"/>
-        </w:numPr>
-      </w:pPr>
-      <w:r>
-        <w:t xml:space="preserve">171</w:t>
-      </w:r>
-    </w:p>
-    <w:p>
-      <w:pPr>
-        <w:numPr>
-          <w:ilvl w:val="0"/>
-          <w:numId w:val="1000"/>
-        </w:numPr>
-      </w:pPr>
-      <w:r>
-        <w:t xml:space="preserve">18</w:t>
-      </w:r>
-    </w:p>
-    <w:p>
-      <w:pPr>
-        <w:numPr>
-          <w:ilvl w:val="0"/>
-          <w:numId w:val="1000"/>
-        </w:numPr>
-      </w:pPr>
-      <w:r>
-        <w:t xml:space="preserve">167</w:t>
-      </w:r>
-    </w:p>
-    <w:p>
-      <w:pPr>
-        <w:numPr>
-          <w:ilvl w:val="0"/>
-          <w:numId w:val="1000"/>
-        </w:numPr>
-      </w:pPr>
-      <w:r>
-        <w:t xml:space="preserve">19</w:t>
-      </w:r>
-    </w:p>
-    <w:p>
-      <w:pPr>
-        <w:numPr>
-          <w:ilvl w:val="0"/>
-          <w:numId w:val="1000"/>
-        </w:numPr>
-      </w:pPr>
-      <w:r>
-        <w:t xml:space="preserve">153</w:t>
-      </w:r>
-    </w:p>
-    <w:p>
-      <w:pPr>
-        <w:numPr>
-          <w:ilvl w:val="0"/>
-          <w:numId w:val="1000"/>
-        </w:numPr>
-      </w:pPr>
-      <w:r>
         <w:t xml:space="preserve">20</w:t>
       </w:r>
     </w:p>
@@ -3531,7 +3575,7 @@
         </w:numPr>
       </w:pPr>
       <w:r>
-        <w:t xml:space="preserve">174</w:t>
+        <w:t xml:space="preserve">183</w:t>
       </w:r>
     </w:p>
     <w:p>
@@ -3553,7 +3597,7 @@
         </w:numPr>
       </w:pPr>
       <w:r>
-        <w:t xml:space="preserve">149</w:t>
+        <w:t xml:space="preserve">163</w:t>
       </w:r>
     </w:p>
     <w:p>
@@ -3584,7 +3628,7 @@
               <a:graphicData uri="http://schemas.openxmlformats.org/drawingml/2006/picture">
                 <pic:pic>
                   <pic:nvPicPr>
-                    <pic:cNvPr descr="media/supplements1/exercise5/DiagramaB-1.svg" id="102" name="Picture"/>
+                    <pic:cNvPr descr="media/supplements1/exercise5/DiagramaD-1.svg" id="102" name="Picture"/>
                     <pic:cNvPicPr>
                       <a:picLocks noChangeArrowheads="1" noChangeAspect="1"/>
                     </pic:cNvPicPr>
@@ -3643,7 +3687,7 @@
               <a:graphicData uri="http://schemas.openxmlformats.org/drawingml/2006/picture">
                 <pic:pic>
                   <pic:nvPicPr>
-                    <pic:cNvPr descr="media/supplements1/exercise5/DiagramaC-1.svg" id="106" name="Picture"/>
+                    <pic:cNvPr descr="media/supplements1/exercise5/DiagramaB-1.svg" id="106" name="Picture"/>
                     <pic:cNvPicPr>
                       <a:picLocks noChangeArrowheads="1" noChangeAspect="1"/>
                     </pic:cNvPicPr>
@@ -3761,7 +3805,7 @@
               <a:graphicData uri="http://schemas.openxmlformats.org/drawingml/2006/picture">
                 <pic:pic>
                   <pic:nvPicPr>
-                    <pic:cNvPr descr="media/supplements1/exercise5/DiagramaD-1.svg" id="114" name="Picture"/>
+                    <pic:cNvPr descr="media/supplements1/exercise5/DiagramaC-1.svg" id="114" name="Picture"/>
                     <pic:cNvPicPr>
                       <a:picLocks noChangeArrowheads="1" noChangeAspect="1"/>
                     </pic:cNvPicPr>
@@ -3832,7 +3876,7 @@
         </w:numPr>
       </w:pPr>
       <w:r>
-        <w:t xml:space="preserve">Mínimo: 149 cm</w:t>
+        <w:t xml:space="preserve">Mínimo: 140 cm</w:t>
       </w:r>
     </w:p>
     <w:p>
@@ -3843,7 +3887,7 @@
         </w:numPr>
       </w:pPr>
       <w:r>
-        <w:t xml:space="preserve">Q1: 156 cm</w:t>
+        <w:t xml:space="preserve">Q1: 159 cm</w:t>
       </w:r>
     </w:p>
     <w:p>
@@ -3854,7 +3898,7 @@
         </w:numPr>
       </w:pPr>
       <w:r>
-        <w:t xml:space="preserve">Mediana: 164 cm</w:t>
+        <w:t xml:space="preserve">Mediana: 171 cm</w:t>
       </w:r>
     </w:p>
     <w:p>
@@ -3865,7 +3909,7 @@
         </w:numPr>
       </w:pPr>
       <w:r>
-        <w:t xml:space="preserve">Q3: 169 cm</w:t>
+        <w:t xml:space="preserve">Q3: 180 cm</w:t>
       </w:r>
     </w:p>
     <w:p>
@@ -3876,7 +3920,7 @@
         </w:numPr>
       </w:pPr>
       <w:r>
-        <w:t xml:space="preserve">Máximo: 174 cm</w:t>
+        <w:t xml:space="preserve">Máximo: 188 cm</w:t>
       </w:r>
     </w:p>
     <w:p>
@@ -3946,6 +3990,17 @@
         </w:numPr>
       </w:pPr>
       <w:r>
+        <w:t xml:space="preserve">Incorrecto. La mediana está mal calculada.</w:t>
+      </w:r>
+    </w:p>
+    <w:p>
+      <w:pPr>
+        <w:numPr>
+          <w:ilvl w:val="1"/>
+          <w:numId w:val="1016"/>
+        </w:numPr>
+      </w:pPr>
+      <w:r>
         <w:t xml:space="preserve">Incorrecto. Los valores están multiplicados por 10.</w:t>
       </w:r>
     </w:p>
@@ -3957,29 +4012,18 @@
         </w:numPr>
       </w:pPr>
       <w:r>
+        <w:t xml:space="preserve">Correcto. Este diagrama representa fielmente todos los valores estadísticos.</w:t>
+      </w:r>
+    </w:p>
+    <w:p>
+      <w:pPr>
+        <w:numPr>
+          <w:ilvl w:val="1"/>
+          <w:numId w:val="1016"/>
+        </w:numPr>
+      </w:pPr>
+      <w:r>
         <w:t xml:space="preserve">Incorrecto. Los cuartiles Q1 y Q3 están invertidos.</w:t>
-      </w:r>
-    </w:p>
-    <w:p>
-      <w:pPr>
-        <w:numPr>
-          <w:ilvl w:val="1"/>
-          <w:numId w:val="1016"/>
-        </w:numPr>
-      </w:pPr>
-      <w:r>
-        <w:t xml:space="preserve">Correcto. Este diagrama representa fielmente todos los valores estadísticos.</w:t>
-      </w:r>
-    </w:p>
-    <w:p>
-      <w:pPr>
-        <w:numPr>
-          <w:ilvl w:val="1"/>
-          <w:numId w:val="1016"/>
-        </w:numPr>
-      </w:pPr>
-      <w:r>
-        <w:t xml:space="preserve">Incorrecto. La mediana está mal calculada.</w:t>
       </w:r>
     </w:p>
     <w:bookmarkEnd w:id="120"/>

</xml_diff>